<commit_message>
testing docummentation needs some pictures for server stuff and also needs a table of contents
</commit_message>
<xml_diff>
--- a/Tesztelési_Dokkumentáció.docx
+++ b/Tesztelési_Dokkumentáció.docx
@@ -356,7 +356,39 @@
         </w:drawing>
       </w:r>
       <w:r>
-        <w:t>Az International Business Machines Kft, avagy röviden az IBM új áttöréseket akar hozni a cloud computing technológiában. Eme munkafolyamathoz, több országban, például Magyarországon is új telephelyeket szervezett meg. Az IBM felbérlet minket, a BandWidth-et, hogy valósítsunk meg egy hálózati topológiát, a 3 új telephely és már meglévő szigony utcai központjuk között. Ez a „Project E</w:t>
+        <w:t xml:space="preserve">Az International Business </w:t>
+      </w:r>
+      <w:proofErr w:type="spellStart"/>
+      <w:r>
+        <w:t>Machines</w:t>
+      </w:r>
+      <w:proofErr w:type="spellEnd"/>
+      <w:r>
+        <w:t xml:space="preserve"> Kft, avagy röviden az IBM új áttöréseket akar hozni a </w:t>
+      </w:r>
+      <w:proofErr w:type="spellStart"/>
+      <w:r>
+        <w:t>cloud</w:t>
+      </w:r>
+      <w:proofErr w:type="spellEnd"/>
+      <w:r>
+        <w:t xml:space="preserve"> </w:t>
+      </w:r>
+      <w:proofErr w:type="spellStart"/>
+      <w:r>
+        <w:t>computing</w:t>
+      </w:r>
+      <w:proofErr w:type="spellEnd"/>
+      <w:r>
+        <w:t xml:space="preserve"> technológiában. Eme munkafolyamathoz, több országban, például Magyarországon is új telephelyeket szervezett meg. Az IBM felbérlet minket, a </w:t>
+      </w:r>
+      <w:proofErr w:type="spellStart"/>
+      <w:r>
+        <w:t>BandWidth-et</w:t>
+      </w:r>
+      <w:proofErr w:type="spellEnd"/>
+      <w:r>
+        <w:t>, hogy valósítsunk meg egy hálózati topológiát, a 3 új telephely és már meglévő szigony utcai központjuk között. Ez a „Project E</w:t>
       </w:r>
       <w:r>
         <w:t>.</w:t>
@@ -416,7 +448,23 @@
         <w:t>tő</w:t>
       </w:r>
       <w:r>
-        <w:t>l. Ezen részek tartalmazzák a routereket, a multilayer switch-t és a szerverszobát. Az utóbbiban vannak benne a</w:t>
+        <w:t xml:space="preserve">l. Ezen részek tartalmazzák a routereket, a </w:t>
+      </w:r>
+      <w:proofErr w:type="spellStart"/>
+      <w:r>
+        <w:t>multilayer</w:t>
+      </w:r>
+      <w:proofErr w:type="spellEnd"/>
+      <w:r>
+        <w:t xml:space="preserve"> </w:t>
+      </w:r>
+      <w:proofErr w:type="spellStart"/>
+      <w:r>
+        <w:t>switch</w:t>
+      </w:r>
+      <w:proofErr w:type="spellEnd"/>
+      <w:r>
+        <w:t>-t és a szerverszobát. Az utóbbiban vannak benne a</w:t>
       </w:r>
       <w:r>
         <w:t>zon</w:t>
@@ -466,9 +514,14 @@
       <w:r>
         <w:t xml:space="preserve"> az Örs vezér tér környékén lévő Fehér út 1. című F1 irodaház egyik emeletének a felét takarja. Az F1 területén zajlik a kész technológiáknak és rendszereknek a tesztelése. A második telephely a Kunigunda útján épített irodaházban van, ott egy </w:t>
       </w:r>
+      <w:proofErr w:type="spellStart"/>
       <w:r>
         <w:lastRenderedPageBreak/>
-        <w:t>emeletnyit bérelt ki az anyacég. Ezen a telephelyen terveznek a Project E</w:t>
+        <w:t>emeletnyit</w:t>
+      </w:r>
+      <w:proofErr w:type="spellEnd"/>
+      <w:r>
+        <w:t xml:space="preserve"> bérelt ki az anyacég. Ezen a telephelyen terveznek a Project E</w:t>
       </w:r>
       <w:r>
         <w:t>.</w:t>
@@ -492,7 +545,15 @@
         <w:t>.</w:t>
       </w:r>
       <w:r>
-        <w:t xml:space="preserve">-hez szükséges kutatásokat elvégezni. A harmadik telephely pedig az Andor utca 21/d lakcímű irodaháznál helyezkedik el, </w:t>
+        <w:t>-</w:t>
+      </w:r>
+      <w:proofErr w:type="spellStart"/>
+      <w:r>
+        <w:t>hez</w:t>
+      </w:r>
+      <w:proofErr w:type="spellEnd"/>
+      <w:r>
+        <w:t xml:space="preserve"> szükséges kutatásokat elvégezni. A harmadik telephely pedig az Andor utca 21/d lakcímű irodaháznál helyezkedik el, </w:t>
       </w:r>
       <w:r>
         <w:t xml:space="preserve">itt </w:t>
@@ -1396,6 +1457,7 @@
         <w:tab/>
         <w:t xml:space="preserve">A </w:t>
       </w:r>
+      <w:proofErr w:type="spellStart"/>
       <w:r>
         <w:rPr>
           <w:b/>
@@ -1410,8 +1472,17 @@
         </w:rPr>
         <w:t>lient</w:t>
       </w:r>
-      <w:r>
-        <w:t xml:space="preserve"> switch megtanulta a </w:t>
+      <w:proofErr w:type="spellEnd"/>
+      <w:r>
+        <w:t xml:space="preserve"> </w:t>
+      </w:r>
+      <w:proofErr w:type="spellStart"/>
+      <w:r>
+        <w:t>switch</w:t>
+      </w:r>
+      <w:proofErr w:type="spellEnd"/>
+      <w:r>
+        <w:t xml:space="preserve"> megtanulta a </w:t>
       </w:r>
       <w:r>
         <w:rPr>
@@ -1421,8 +1492,17 @@
         <w:t>VTP</w:t>
       </w:r>
       <w:r>
-        <w:t xml:space="preserve"> server-től az új </w:t>
-      </w:r>
+        <w:t xml:space="preserve"> server-</w:t>
+      </w:r>
+      <w:proofErr w:type="spellStart"/>
+      <w:r>
+        <w:t>től</w:t>
+      </w:r>
+      <w:proofErr w:type="spellEnd"/>
+      <w:r>
+        <w:t xml:space="preserve"> az új </w:t>
+      </w:r>
+      <w:proofErr w:type="spellStart"/>
       <w:r>
         <w:rPr>
           <w:i/>
@@ -1430,9 +1510,19 @@
         </w:rPr>
         <w:t>vlan</w:t>
       </w:r>
-      <w:r>
-        <w:t xml:space="preserve">-t és meg is jelent a switch által ismert </w:t>
-      </w:r>
+      <w:proofErr w:type="spellEnd"/>
+      <w:r>
+        <w:t xml:space="preserve">-t és meg is jelent a </w:t>
+      </w:r>
+      <w:proofErr w:type="spellStart"/>
+      <w:r>
+        <w:t>switch</w:t>
+      </w:r>
+      <w:proofErr w:type="spellEnd"/>
+      <w:r>
+        <w:t xml:space="preserve"> által ismert </w:t>
+      </w:r>
+      <w:proofErr w:type="spellStart"/>
       <w:r>
         <w:rPr>
           <w:i/>
@@ -1440,6 +1530,7 @@
         </w:rPr>
         <w:t>vlan</w:t>
       </w:r>
+      <w:proofErr w:type="spellEnd"/>
       <w:r>
         <w:t>-ok listájában.</w:t>
       </w:r>
@@ -1523,8 +1614,13 @@
       <w:r>
         <w:t xml:space="preserve">a két </w:t>
       </w:r>
-      <w:r>
-        <w:t>switchnek.</w:t>
+      <w:proofErr w:type="spellStart"/>
+      <w:r>
+        <w:t>switchnek</w:t>
+      </w:r>
+      <w:proofErr w:type="spellEnd"/>
+      <w:r>
+        <w:t>.</w:t>
       </w:r>
     </w:p>
     <w:p>
@@ -1630,7 +1726,15 @@
         <w:t>SW_KUN_1</w:t>
       </w:r>
       <w:r>
-        <w:t xml:space="preserve"> switchen át fogjuk állítani a </w:t>
+        <w:t xml:space="preserve"> </w:t>
+      </w:r>
+      <w:proofErr w:type="spellStart"/>
+      <w:r>
+        <w:t>switchen</w:t>
+      </w:r>
+      <w:proofErr w:type="spellEnd"/>
+      <w:r>
+        <w:t xml:space="preserve"> át fogjuk állítani a </w:t>
       </w:r>
       <w:r>
         <w:rPr>
@@ -1661,7 +1765,15 @@
         <w:t>Projectenis.com</w:t>
       </w:r>
       <w:r>
-        <w:t xml:space="preserve"> -ról </w:t>
+        <w:t xml:space="preserve"> -</w:t>
+      </w:r>
+      <w:proofErr w:type="spellStart"/>
+      <w:r>
+        <w:t>ról</w:t>
+      </w:r>
+      <w:proofErr w:type="spellEnd"/>
+      <w:r>
+        <w:t xml:space="preserve"> </w:t>
       </w:r>
       <w:r>
         <w:rPr>
@@ -1672,7 +1784,15 @@
         <w:t>cisco.com</w:t>
       </w:r>
       <w:r>
-        <w:t xml:space="preserve"> -ra.</w:t>
+        <w:t xml:space="preserve"> -</w:t>
+      </w:r>
+      <w:proofErr w:type="spellStart"/>
+      <w:r>
+        <w:t>ra</w:t>
+      </w:r>
+      <w:proofErr w:type="spellEnd"/>
+      <w:r>
+        <w:t>.</w:t>
       </w:r>
     </w:p>
     <w:p>
@@ -1714,7 +1834,15 @@
         <w:t>VTP</w:t>
       </w:r>
       <w:r>
-        <w:t xml:space="preserve"> kapcsolat a két switch között megszakad, mivel minden </w:t>
+        <w:t xml:space="preserve"> kapcsolat a két </w:t>
+      </w:r>
+      <w:proofErr w:type="spellStart"/>
+      <w:r>
+        <w:t>switch</w:t>
+      </w:r>
+      <w:proofErr w:type="spellEnd"/>
+      <w:r>
+        <w:t xml:space="preserve"> között megszakad, mivel minden </w:t>
       </w:r>
       <w:r>
         <w:rPr>
@@ -1724,7 +1852,15 @@
         <w:t>VTP</w:t>
       </w:r>
       <w:r>
-        <w:t xml:space="preserve"> adatuknak egyezniük kell ahhoz, hogy működjön rendeltetésszerűen a tesztelt protokoll.</w:t>
+        <w:t xml:space="preserve"> adatuknak egyezniük kell ahhoz, hogy </w:t>
+      </w:r>
+      <w:proofErr w:type="spellStart"/>
+      <w:r>
+        <w:t>működjön</w:t>
+      </w:r>
+      <w:proofErr w:type="spellEnd"/>
+      <w:r>
+        <w:t xml:space="preserve"> rendeltetésszerűen a tesztelt protokoll.</w:t>
       </w:r>
     </w:p>
     <w:p>
@@ -2073,6 +2209,7 @@
         <w:tab/>
         <w:t xml:space="preserve">A rendszer értesít arról minket, hogy valamelyik </w:t>
       </w:r>
+      <w:proofErr w:type="spellStart"/>
       <w:r>
         <w:rPr>
           <w:i/>
@@ -2080,6 +2217,7 @@
         </w:rPr>
         <w:t>porton</w:t>
       </w:r>
+      <w:proofErr w:type="spellEnd"/>
       <w:r>
         <w:t xml:space="preserve"> történt egy </w:t>
       </w:r>
@@ -2374,6 +2512,7 @@
       <w:r>
         <w:t xml:space="preserve"> kapcsoló </w:t>
       </w:r>
+      <w:proofErr w:type="spellStart"/>
       <w:r>
         <w:rPr>
           <w:b/>
@@ -2381,9 +2520,11 @@
         </w:rPr>
         <w:t>Transparent</w:t>
       </w:r>
+      <w:proofErr w:type="spellEnd"/>
       <w:r>
         <w:t xml:space="preserve"> üzemmódba van kapcsolva </w:t>
       </w:r>
+      <w:proofErr w:type="spellStart"/>
       <w:r>
         <w:rPr>
           <w:b/>
@@ -2391,6 +2532,7 @@
         </w:rPr>
         <w:t>Client</w:t>
       </w:r>
+      <w:proofErr w:type="spellEnd"/>
       <w:r>
         <w:t xml:space="preserve"> helyett</w:t>
       </w:r>
@@ -2501,11 +2643,20 @@
         <w:t>SW_KUN_1</w:t>
       </w:r>
       <w:r>
-        <w:t xml:space="preserve"> switchen át fogjuk </w:t>
+        <w:t xml:space="preserve"> </w:t>
+      </w:r>
+      <w:proofErr w:type="spellStart"/>
+      <w:r>
+        <w:t>switchen</w:t>
+      </w:r>
+      <w:proofErr w:type="spellEnd"/>
+      <w:r>
+        <w:t xml:space="preserve"> át fogjuk </w:t>
       </w:r>
       <w:r>
         <w:t xml:space="preserve">kapcsolni </w:t>
       </w:r>
+      <w:proofErr w:type="spellStart"/>
       <w:r>
         <w:rPr>
           <w:b/>
@@ -2513,9 +2664,19 @@
         </w:rPr>
         <w:t>Client</w:t>
       </w:r>
-      <w:r>
-        <w:t xml:space="preserve"> üzemmúdból </w:t>
-      </w:r>
+      <w:proofErr w:type="spellEnd"/>
+      <w:r>
+        <w:t xml:space="preserve"> </w:t>
+      </w:r>
+      <w:proofErr w:type="spellStart"/>
+      <w:r>
+        <w:t>üzemmúdból</w:t>
+      </w:r>
+      <w:proofErr w:type="spellEnd"/>
+      <w:r>
+        <w:t xml:space="preserve"> </w:t>
+      </w:r>
+      <w:proofErr w:type="spellStart"/>
       <w:r>
         <w:rPr>
           <w:b/>
@@ -2523,6 +2684,7 @@
         </w:rPr>
         <w:t>Transparent</w:t>
       </w:r>
+      <w:proofErr w:type="spellEnd"/>
       <w:r>
         <w:t>-be</w:t>
       </w:r>
@@ -2583,6 +2745,7 @@
       <w:r>
         <w:t xml:space="preserve">-es </w:t>
       </w:r>
+      <w:proofErr w:type="spellStart"/>
       <w:r>
         <w:rPr>
           <w:i/>
@@ -2590,6 +2753,7 @@
         </w:rPr>
         <w:t>vlan</w:t>
       </w:r>
+      <w:proofErr w:type="spellEnd"/>
       <w:r>
         <w:t>-t</w:t>
       </w:r>
@@ -2614,14 +2778,20 @@
         <w:t>Server</w:t>
       </w:r>
       <w:r>
-        <w:t>-től</w:t>
-      </w:r>
+        <w:t>-</w:t>
+      </w:r>
+      <w:proofErr w:type="spellStart"/>
+      <w:r>
+        <w:t>től</w:t>
+      </w:r>
+      <w:proofErr w:type="spellEnd"/>
       <w:r>
         <w:t>,</w:t>
       </w:r>
       <w:r>
         <w:t xml:space="preserve"> mivel </w:t>
       </w:r>
+      <w:proofErr w:type="spellStart"/>
       <w:r>
         <w:rPr>
           <w:b/>
@@ -2629,6 +2799,7 @@
         </w:rPr>
         <w:t>Transparent</w:t>
       </w:r>
+      <w:proofErr w:type="spellEnd"/>
       <w:r>
         <w:t xml:space="preserve"> üzemmódban van,</w:t>
       </w:r>
@@ -2940,6 +3111,7 @@
         <w:tab/>
         <w:t xml:space="preserve">Bebizonyítottuk azt, hogyha a kapcsolónk </w:t>
       </w:r>
+      <w:proofErr w:type="spellStart"/>
       <w:r>
         <w:rPr>
           <w:b/>
@@ -2947,9 +3119,11 @@
         </w:rPr>
         <w:t>Transparent</w:t>
       </w:r>
+      <w:proofErr w:type="spellEnd"/>
       <w:r>
         <w:t xml:space="preserve"> módba van kapcsolva, akkor nem fogja megtanulni azokat a </w:t>
       </w:r>
+      <w:proofErr w:type="spellStart"/>
       <w:r>
         <w:rPr>
           <w:i/>
@@ -2957,6 +3131,7 @@
         </w:rPr>
         <w:t>vlan</w:t>
       </w:r>
+      <w:proofErr w:type="spellEnd"/>
       <w:r>
         <w:t xml:space="preserve"> adatokat, amiket a </w:t>
       </w:r>
@@ -3097,6 +3272,7 @@
           <w:szCs w:val="44"/>
           <w:u w:val="single"/>
         </w:rPr>
+        <w:lastRenderedPageBreak/>
         <w:t>HS</w:t>
       </w:r>
       <w:r>
@@ -3150,13 +3326,50 @@
         <w:tab/>
       </w:r>
       <w:r>
-        <w:t xml:space="preserve">A Kunigunda útjai telephelyen megvalósított </w:t>
-      </w:r>
-      <w:r>
-        <w:t>STP</w:t>
-      </w:r>
-      <w:r>
-        <w:t xml:space="preserve"> tesztelésén át fogjuk szemléltetni a helyes működést.</w:t>
+        <w:t>A</w:t>
+      </w:r>
+      <w:r>
+        <w:t xml:space="preserve">z </w:t>
+      </w:r>
+      <w:r>
+        <w:rPr>
+          <w:b/>
+          <w:bCs/>
+        </w:rPr>
+        <w:t>F1</w:t>
+      </w:r>
+      <w:r>
+        <w:t xml:space="preserve"> telephelyen teszteljük azt, hogy a </w:t>
+      </w:r>
+      <w:r>
+        <w:rPr>
+          <w:b/>
+          <w:bCs/>
+        </w:rPr>
+        <w:t>HSRP</w:t>
+      </w:r>
+      <w:r>
+        <w:t xml:space="preserve"> protokoll megfelelően működik-e egy </w:t>
+      </w:r>
+      <w:r>
+        <w:rPr>
+          <w:i/>
+          <w:iCs/>
+        </w:rPr>
+        <w:t>router</w:t>
+      </w:r>
+      <w:r>
+        <w:t xml:space="preserve"> </w:t>
+      </w:r>
+      <w:r>
+        <w:rPr>
+          <w:i/>
+          <w:iCs/>
+        </w:rPr>
+        <w:t>kiesése</w:t>
+      </w:r>
+      <w:r>
+        <w:t xml:space="preserve"> esetén.</w:t>
       </w:r>
     </w:p>
     <w:p>
@@ -3196,6 +3409,53 @@
           <w:noProof/>
         </w:rPr>
       </w:pPr>
+      <w:r>
+        <w:rPr>
+          <w:b/>
+          <w:bCs/>
+          <w:noProof/>
+        </w:rPr>
+        <w:t>R1_F1</w:t>
+      </w:r>
+      <w:r>
+        <w:rPr>
+          <w:b/>
+          <w:bCs/>
+          <w:noProof/>
+        </w:rPr>
+        <w:t xml:space="preserve"> (Active)</w:t>
+      </w:r>
+    </w:p>
+    <w:p>
+      <w:pPr>
+        <w:pStyle w:val="Listaszerbekezds"/>
+        <w:numPr>
+          <w:ilvl w:val="0"/>
+          <w:numId w:val="4"/>
+        </w:numPr>
+        <w:jc w:val="both"/>
+        <w:rPr>
+          <w:b/>
+          <w:bCs/>
+          <w:noProof/>
+        </w:rPr>
+      </w:pPr>
+      <w:r>
+        <w:rPr>
+          <w:b/>
+          <w:bCs/>
+          <w:noProof/>
+        </w:rPr>
+        <w:t>R2_F1</w:t>
+      </w:r>
+      <w:r>
+        <w:rPr>
+          <w:b/>
+          <w:bCs/>
+          <w:noProof/>
+        </w:rPr>
+        <w:t xml:space="preserve"> (Standby)</w:t>
+      </w:r>
     </w:p>
     <w:p>
       <w:pPr>
@@ -3223,17 +3483,66 @@
         <w:tab/>
         <w:t>A teszt során</w:t>
       </w:r>
-    </w:p>
-    <w:p>
-      <w:pPr>
-        <w:jc w:val="both"/>
-      </w:pPr>
-    </w:p>
-    <w:p>
-      <w:pPr>
-        <w:jc w:val="both"/>
-      </w:pPr>
-      <w:r>
+      <w:r>
+        <w:t xml:space="preserve"> lefogjuk kapcsolni az </w:t>
+      </w:r>
+      <w:r>
+        <w:rPr>
+          <w:b/>
+          <w:bCs/>
+        </w:rPr>
+        <w:t>R1_F1</w:t>
+      </w:r>
+      <w:r>
+        <w:t xml:space="preserve"> routert és </w:t>
+      </w:r>
+      <w:r>
+        <w:t>megnézzük,</w:t>
+      </w:r>
+      <w:r>
+        <w:t xml:space="preserve"> hogy utána is lesz-e internet elérésünk </w:t>
+      </w:r>
+      <w:r>
+        <w:rPr>
+          <w:b/>
+          <w:bCs/>
+        </w:rPr>
+        <w:t>R2_F1</w:t>
+      </w:r>
+      <w:r>
+        <w:t xml:space="preserve"> router-en keresztül az </w:t>
+      </w:r>
+      <w:r>
+        <w:rPr>
+          <w:b/>
+          <w:bCs/>
+        </w:rPr>
+        <w:t>F1_LINUX-TEAM_A</w:t>
+      </w:r>
+      <w:r>
+        <w:t xml:space="preserve"> számítógépen.</w:t>
+      </w:r>
+    </w:p>
+    <w:p>
+      <w:pPr>
+        <w:jc w:val="both"/>
+      </w:pPr>
+    </w:p>
+    <w:p>
+      <w:pPr>
+        <w:jc w:val="both"/>
+        <w:rPr>
+          <w:i/>
+          <w:iCs/>
+          <w:u w:val="single"/>
+        </w:rPr>
+      </w:pPr>
+      <w:r>
+        <w:rPr>
+          <w:i/>
+          <w:iCs/>
+          <w:u w:val="single"/>
+        </w:rPr>
         <w:t>Teszt várt eredménye:</w:t>
       </w:r>
     </w:p>
@@ -3242,25 +3551,447 @@
         <w:jc w:val="both"/>
       </w:pPr>
       <w:r>
+        <w:rPr>
+          <w:noProof/>
+        </w:rPr>
+        <w:drawing>
+          <wp:anchor distT="0" distB="0" distL="114300" distR="114300" simplePos="0" relativeHeight="251697152" behindDoc="0" locked="0" layoutInCell="1" allowOverlap="1" wp14:anchorId="150CBA41" wp14:editId="2BA4CA1B">
+            <wp:simplePos x="0" y="0"/>
+            <wp:positionH relativeFrom="margin">
+              <wp:align>center</wp:align>
+            </wp:positionH>
+            <wp:positionV relativeFrom="paragraph">
+              <wp:posOffset>2223770</wp:posOffset>
+            </wp:positionV>
+            <wp:extent cx="5180965" cy="2613660"/>
+            <wp:effectExtent l="0" t="0" r="635" b="0"/>
+            <wp:wrapTopAndBottom/>
+            <wp:docPr id="648018729" name="Kép 47"/>
+            <wp:cNvGraphicFramePr>
+              <a:graphicFrameLocks xmlns:a="http://schemas.openxmlformats.org/drawingml/2006/main" noChangeAspect="1"/>
+            </wp:cNvGraphicFramePr>
+            <a:graphic xmlns:a="http://schemas.openxmlformats.org/drawingml/2006/main">
+              <a:graphicData uri="http://schemas.openxmlformats.org/drawingml/2006/picture">
+                <pic:pic xmlns:pic="http://schemas.openxmlformats.org/drawingml/2006/picture">
+                  <pic:nvPicPr>
+                    <pic:cNvPr id="0" name="Picture 234"/>
+                    <pic:cNvPicPr>
+                      <a:picLocks noChangeAspect="1" noChangeArrowheads="1"/>
+                    </pic:cNvPicPr>
+                  </pic:nvPicPr>
+                  <pic:blipFill>
+                    <a:blip r:embed="rId25" cstate="print">
+                      <a:extLst>
+                        <a:ext uri="{28A0092B-C50C-407E-A947-70E740481C1C}">
+                          <a14:useLocalDpi xmlns:a14="http://schemas.microsoft.com/office/drawing/2010/main" val="0"/>
+                        </a:ext>
+                      </a:extLst>
+                    </a:blip>
+                    <a:srcRect/>
+                    <a:stretch>
+                      <a:fillRect/>
+                    </a:stretch>
+                  </pic:blipFill>
+                  <pic:spPr bwMode="auto">
+                    <a:xfrm>
+                      <a:off x="0" y="0"/>
+                      <a:ext cx="5180965" cy="2613660"/>
+                    </a:xfrm>
+                    <a:prstGeom prst="rect">
+                      <a:avLst/>
+                    </a:prstGeom>
+                    <a:noFill/>
+                    <a:ln>
+                      <a:noFill/>
+                    </a:ln>
+                  </pic:spPr>
+                </pic:pic>
+              </a:graphicData>
+            </a:graphic>
+            <wp14:sizeRelH relativeFrom="margin">
+              <wp14:pctWidth>0</wp14:pctWidth>
+            </wp14:sizeRelH>
+            <wp14:sizeRelV relativeFrom="margin">
+              <wp14:pctHeight>0</wp14:pctHeight>
+            </wp14:sizeRelV>
+          </wp:anchor>
+        </w:drawing>
+      </w:r>
+      <w:r>
+        <w:rPr>
+          <w:noProof/>
+        </w:rPr>
+        <w:drawing>
+          <wp:anchor distT="0" distB="0" distL="114300" distR="114300" simplePos="0" relativeHeight="251696128" behindDoc="0" locked="0" layoutInCell="1" allowOverlap="1" wp14:anchorId="17ECF507" wp14:editId="7814A425">
+            <wp:simplePos x="0" y="0"/>
+            <wp:positionH relativeFrom="margin">
+              <wp:align>center</wp:align>
+            </wp:positionH>
+            <wp:positionV relativeFrom="paragraph">
+              <wp:posOffset>707428</wp:posOffset>
+            </wp:positionV>
+            <wp:extent cx="3571539" cy="1328294"/>
+            <wp:effectExtent l="0" t="0" r="0" b="5715"/>
+            <wp:wrapTopAndBottom/>
+            <wp:docPr id="2099090160" name="Kép 46"/>
+            <wp:cNvGraphicFramePr>
+              <a:graphicFrameLocks xmlns:a="http://schemas.openxmlformats.org/drawingml/2006/main" noChangeAspect="1"/>
+            </wp:cNvGraphicFramePr>
+            <a:graphic xmlns:a="http://schemas.openxmlformats.org/drawingml/2006/main">
+              <a:graphicData uri="http://schemas.openxmlformats.org/drawingml/2006/picture">
+                <pic:pic xmlns:pic="http://schemas.openxmlformats.org/drawingml/2006/picture">
+                  <pic:nvPicPr>
+                    <pic:cNvPr id="0" name="Picture 233"/>
+                    <pic:cNvPicPr>
+                      <a:picLocks noChangeAspect="1" noChangeArrowheads="1"/>
+                    </pic:cNvPicPr>
+                  </pic:nvPicPr>
+                  <pic:blipFill>
+                    <a:blip r:embed="rId26">
+                      <a:extLst>
+                        <a:ext uri="{28A0092B-C50C-407E-A947-70E740481C1C}">
+                          <a14:useLocalDpi xmlns:a14="http://schemas.microsoft.com/office/drawing/2010/main" val="0"/>
+                        </a:ext>
+                      </a:extLst>
+                    </a:blip>
+                    <a:srcRect/>
+                    <a:stretch>
+                      <a:fillRect/>
+                    </a:stretch>
+                  </pic:blipFill>
+                  <pic:spPr bwMode="auto">
+                    <a:xfrm>
+                      <a:off x="0" y="0"/>
+                      <a:ext cx="3571539" cy="1328294"/>
+                    </a:xfrm>
+                    <a:prstGeom prst="rect">
+                      <a:avLst/>
+                    </a:prstGeom>
+                    <a:noFill/>
+                    <a:ln>
+                      <a:noFill/>
+                    </a:ln>
+                  </pic:spPr>
+                </pic:pic>
+              </a:graphicData>
+            </a:graphic>
+          </wp:anchor>
+        </w:drawing>
+      </w:r>
+      <w:r>
         <w:tab/>
       </w:r>
-    </w:p>
-    <w:p>
-      <w:pPr>
-        <w:jc w:val="both"/>
-      </w:pPr>
-    </w:p>
-    <w:p>
-      <w:pPr>
-        <w:jc w:val="both"/>
-      </w:pPr>
-    </w:p>
-    <w:p>
-      <w:pPr>
-        <w:jc w:val="both"/>
-      </w:pPr>
-      <w:r>
-        <w:t>A teszt eredménye – SIKERES/SIKERTEKLEN</w:t>
+      <w:r>
+        <w:t xml:space="preserve">Az </w:t>
+      </w:r>
+      <w:r>
+        <w:rPr>
+          <w:b/>
+          <w:bCs/>
+        </w:rPr>
+        <w:t>R1_F1</w:t>
+      </w:r>
+      <w:r>
+        <w:t xml:space="preserve"> kiesése után az </w:t>
+      </w:r>
+      <w:r>
+        <w:rPr>
+          <w:b/>
+          <w:bCs/>
+        </w:rPr>
+        <w:t>R2_F1</w:t>
+      </w:r>
+      <w:r>
+        <w:t xml:space="preserve"> át fogja venni a forgalomirányítás szerepét </w:t>
+      </w:r>
+      <w:r>
+        <w:t>és folytatódni fog tovább az adatforgalom.</w:t>
+      </w:r>
+    </w:p>
+    <w:p>
+      <w:pPr>
+        <w:jc w:val="both"/>
+      </w:pPr>
+    </w:p>
+    <w:p>
+      <w:pPr>
+        <w:jc w:val="both"/>
+      </w:pPr>
+      <w:r>
+        <w:rPr>
+          <w:noProof/>
+        </w:rPr>
+        <w:lastRenderedPageBreak/>
+        <w:drawing>
+          <wp:anchor distT="0" distB="0" distL="114300" distR="114300" simplePos="0" relativeHeight="251700224" behindDoc="0" locked="0" layoutInCell="1" allowOverlap="1" wp14:anchorId="35E87D9D" wp14:editId="0BDA01FE">
+            <wp:simplePos x="0" y="0"/>
+            <wp:positionH relativeFrom="column">
+              <wp:posOffset>2875915</wp:posOffset>
+            </wp:positionH>
+            <wp:positionV relativeFrom="paragraph">
+              <wp:posOffset>3719867</wp:posOffset>
+            </wp:positionV>
+            <wp:extent cx="3291840" cy="3383915"/>
+            <wp:effectExtent l="0" t="0" r="3810" b="6985"/>
+            <wp:wrapTopAndBottom/>
+            <wp:docPr id="1585306794" name="Kép 50"/>
+            <wp:cNvGraphicFramePr>
+              <a:graphicFrameLocks xmlns:a="http://schemas.openxmlformats.org/drawingml/2006/main" noChangeAspect="1"/>
+            </wp:cNvGraphicFramePr>
+            <a:graphic xmlns:a="http://schemas.openxmlformats.org/drawingml/2006/main">
+              <a:graphicData uri="http://schemas.openxmlformats.org/drawingml/2006/picture">
+                <pic:pic xmlns:pic="http://schemas.openxmlformats.org/drawingml/2006/picture">
+                  <pic:nvPicPr>
+                    <pic:cNvPr id="0" name="Picture 237"/>
+                    <pic:cNvPicPr>
+                      <a:picLocks noChangeAspect="1" noChangeArrowheads="1"/>
+                    </pic:cNvPicPr>
+                  </pic:nvPicPr>
+                  <pic:blipFill>
+                    <a:blip r:embed="rId27">
+                      <a:extLst>
+                        <a:ext uri="{28A0092B-C50C-407E-A947-70E740481C1C}">
+                          <a14:useLocalDpi xmlns:a14="http://schemas.microsoft.com/office/drawing/2010/main" val="0"/>
+                        </a:ext>
+                      </a:extLst>
+                    </a:blip>
+                    <a:srcRect/>
+                    <a:stretch>
+                      <a:fillRect/>
+                    </a:stretch>
+                  </pic:blipFill>
+                  <pic:spPr bwMode="auto">
+                    <a:xfrm>
+                      <a:off x="0" y="0"/>
+                      <a:ext cx="3291840" cy="3383915"/>
+                    </a:xfrm>
+                    <a:prstGeom prst="rect">
+                      <a:avLst/>
+                    </a:prstGeom>
+                    <a:noFill/>
+                    <a:ln>
+                      <a:noFill/>
+                    </a:ln>
+                  </pic:spPr>
+                </pic:pic>
+              </a:graphicData>
+            </a:graphic>
+            <wp14:sizeRelH relativeFrom="margin">
+              <wp14:pctWidth>0</wp14:pctWidth>
+            </wp14:sizeRelH>
+            <wp14:sizeRelV relativeFrom="margin">
+              <wp14:pctHeight>0</wp14:pctHeight>
+            </wp14:sizeRelV>
+          </wp:anchor>
+        </w:drawing>
+      </w:r>
+      <w:r>
+        <w:rPr>
+          <w:noProof/>
+        </w:rPr>
+        <w:drawing>
+          <wp:anchor distT="0" distB="0" distL="114300" distR="114300" simplePos="0" relativeHeight="251699200" behindDoc="0" locked="0" layoutInCell="1" allowOverlap="1" wp14:anchorId="0E75EB76" wp14:editId="0BE04202">
+            <wp:simplePos x="0" y="0"/>
+            <wp:positionH relativeFrom="margin">
+              <wp:posOffset>-451298</wp:posOffset>
+            </wp:positionH>
+            <wp:positionV relativeFrom="paragraph">
+              <wp:posOffset>3715385</wp:posOffset>
+            </wp:positionV>
+            <wp:extent cx="3306445" cy="3399155"/>
+            <wp:effectExtent l="0" t="0" r="8255" b="0"/>
+            <wp:wrapTopAndBottom/>
+            <wp:docPr id="137462260" name="Kép 49"/>
+            <wp:cNvGraphicFramePr>
+              <a:graphicFrameLocks xmlns:a="http://schemas.openxmlformats.org/drawingml/2006/main" noChangeAspect="1"/>
+            </wp:cNvGraphicFramePr>
+            <a:graphic xmlns:a="http://schemas.openxmlformats.org/drawingml/2006/main">
+              <a:graphicData uri="http://schemas.openxmlformats.org/drawingml/2006/picture">
+                <pic:pic xmlns:pic="http://schemas.openxmlformats.org/drawingml/2006/picture">
+                  <pic:nvPicPr>
+                    <pic:cNvPr id="0" name="Picture 236"/>
+                    <pic:cNvPicPr>
+                      <a:picLocks noChangeAspect="1" noChangeArrowheads="1"/>
+                    </pic:cNvPicPr>
+                  </pic:nvPicPr>
+                  <pic:blipFill>
+                    <a:blip r:embed="rId28">
+                      <a:extLst>
+                        <a:ext uri="{28A0092B-C50C-407E-A947-70E740481C1C}">
+                          <a14:useLocalDpi xmlns:a14="http://schemas.microsoft.com/office/drawing/2010/main" val="0"/>
+                        </a:ext>
+                      </a:extLst>
+                    </a:blip>
+                    <a:srcRect/>
+                    <a:stretch>
+                      <a:fillRect/>
+                    </a:stretch>
+                  </pic:blipFill>
+                  <pic:spPr bwMode="auto">
+                    <a:xfrm>
+                      <a:off x="0" y="0"/>
+                      <a:ext cx="3306445" cy="3399155"/>
+                    </a:xfrm>
+                    <a:prstGeom prst="rect">
+                      <a:avLst/>
+                    </a:prstGeom>
+                    <a:noFill/>
+                    <a:ln>
+                      <a:noFill/>
+                    </a:ln>
+                  </pic:spPr>
+                </pic:pic>
+              </a:graphicData>
+            </a:graphic>
+          </wp:anchor>
+        </w:drawing>
+      </w:r>
+      <w:r>
+        <w:rPr>
+          <w:noProof/>
+        </w:rPr>
+        <w:drawing>
+          <wp:anchor distT="0" distB="0" distL="114300" distR="114300" simplePos="0" relativeHeight="251701248" behindDoc="0" locked="0" layoutInCell="1" allowOverlap="1" wp14:anchorId="651B2FC6" wp14:editId="1805E1B6">
+            <wp:simplePos x="0" y="0"/>
+            <wp:positionH relativeFrom="margin">
+              <wp:align>center</wp:align>
+            </wp:positionH>
+            <wp:positionV relativeFrom="paragraph">
+              <wp:posOffset>7039610</wp:posOffset>
+            </wp:positionV>
+            <wp:extent cx="3108960" cy="1835785"/>
+            <wp:effectExtent l="0" t="0" r="0" b="0"/>
+            <wp:wrapTopAndBottom/>
+            <wp:docPr id="947709267" name="Kép 51"/>
+            <wp:cNvGraphicFramePr>
+              <a:graphicFrameLocks xmlns:a="http://schemas.openxmlformats.org/drawingml/2006/main" noChangeAspect="1"/>
+            </wp:cNvGraphicFramePr>
+            <a:graphic xmlns:a="http://schemas.openxmlformats.org/drawingml/2006/main">
+              <a:graphicData uri="http://schemas.openxmlformats.org/drawingml/2006/picture">
+                <pic:pic xmlns:pic="http://schemas.openxmlformats.org/drawingml/2006/picture">
+                  <pic:nvPicPr>
+                    <pic:cNvPr id="0" name="Picture 238"/>
+                    <pic:cNvPicPr>
+                      <a:picLocks noChangeAspect="1" noChangeArrowheads="1"/>
+                    </pic:cNvPicPr>
+                  </pic:nvPicPr>
+                  <pic:blipFill>
+                    <a:blip r:embed="rId29">
+                      <a:extLst>
+                        <a:ext uri="{28A0092B-C50C-407E-A947-70E740481C1C}">
+                          <a14:useLocalDpi xmlns:a14="http://schemas.microsoft.com/office/drawing/2010/main" val="0"/>
+                        </a:ext>
+                      </a:extLst>
+                    </a:blip>
+                    <a:srcRect/>
+                    <a:stretch>
+                      <a:fillRect/>
+                    </a:stretch>
+                  </pic:blipFill>
+                  <pic:spPr bwMode="auto">
+                    <a:xfrm>
+                      <a:off x="0" y="0"/>
+                      <a:ext cx="3108960" cy="1835785"/>
+                    </a:xfrm>
+                    <a:prstGeom prst="rect">
+                      <a:avLst/>
+                    </a:prstGeom>
+                    <a:noFill/>
+                    <a:ln>
+                      <a:noFill/>
+                    </a:ln>
+                  </pic:spPr>
+                </pic:pic>
+              </a:graphicData>
+            </a:graphic>
+          </wp:anchor>
+        </w:drawing>
+      </w:r>
+      <w:r>
+        <w:rPr>
+          <w:noProof/>
+        </w:rPr>
+        <w:drawing>
+          <wp:anchor distT="0" distB="0" distL="114300" distR="114300" simplePos="0" relativeHeight="251698176" behindDoc="0" locked="0" layoutInCell="1" allowOverlap="1" wp14:anchorId="55A7A29B" wp14:editId="66CA2CE6">
+            <wp:simplePos x="0" y="0"/>
+            <wp:positionH relativeFrom="margin">
+              <wp:align>center</wp:align>
+            </wp:positionH>
+            <wp:positionV relativeFrom="paragraph">
+              <wp:posOffset>261806</wp:posOffset>
+            </wp:positionV>
+            <wp:extent cx="3343910" cy="3431540"/>
+            <wp:effectExtent l="0" t="0" r="8890" b="0"/>
+            <wp:wrapTopAndBottom/>
+            <wp:docPr id="2018182950" name="Kép 48"/>
+            <wp:cNvGraphicFramePr>
+              <a:graphicFrameLocks xmlns:a="http://schemas.openxmlformats.org/drawingml/2006/main" noChangeAspect="1"/>
+            </wp:cNvGraphicFramePr>
+            <a:graphic xmlns:a="http://schemas.openxmlformats.org/drawingml/2006/main">
+              <a:graphicData uri="http://schemas.openxmlformats.org/drawingml/2006/picture">
+                <pic:pic xmlns:pic="http://schemas.openxmlformats.org/drawingml/2006/picture">
+                  <pic:nvPicPr>
+                    <pic:cNvPr id="0" name="Picture 235"/>
+                    <pic:cNvPicPr>
+                      <a:picLocks noChangeAspect="1" noChangeArrowheads="1"/>
+                    </pic:cNvPicPr>
+                  </pic:nvPicPr>
+                  <pic:blipFill>
+                    <a:blip r:embed="rId30">
+                      <a:extLst>
+                        <a:ext uri="{28A0092B-C50C-407E-A947-70E740481C1C}">
+                          <a14:useLocalDpi xmlns:a14="http://schemas.microsoft.com/office/drawing/2010/main" val="0"/>
+                        </a:ext>
+                      </a:extLst>
+                    </a:blip>
+                    <a:srcRect/>
+                    <a:stretch>
+                      <a:fillRect/>
+                    </a:stretch>
+                  </pic:blipFill>
+                  <pic:spPr bwMode="auto">
+                    <a:xfrm>
+                      <a:off x="0" y="0"/>
+                      <a:ext cx="3343910" cy="3431540"/>
+                    </a:xfrm>
+                    <a:prstGeom prst="rect">
+                      <a:avLst/>
+                    </a:prstGeom>
+                    <a:noFill/>
+                    <a:ln>
+                      <a:noFill/>
+                    </a:ln>
+                  </pic:spPr>
+                </pic:pic>
+              </a:graphicData>
+            </a:graphic>
+            <wp14:sizeRelH relativeFrom="margin">
+              <wp14:pctWidth>0</wp14:pctWidth>
+            </wp14:sizeRelH>
+            <wp14:sizeRelV relativeFrom="margin">
+              <wp14:pctHeight>0</wp14:pctHeight>
+            </wp14:sizeRelV>
+          </wp:anchor>
+        </w:drawing>
+      </w:r>
+    </w:p>
+    <w:p>
+      <w:pPr>
+        <w:jc w:val="both"/>
+        <w:rPr>
+          <w:i/>
+          <w:iCs/>
+          <w:u w:val="single"/>
+        </w:rPr>
+      </w:pPr>
+      <w:r>
+        <w:rPr>
+          <w:i/>
+          <w:iCs/>
+          <w:u w:val="single"/>
+        </w:rPr>
+        <w:lastRenderedPageBreak/>
+        <w:t>A teszt eredménye – SIKERES</w:t>
       </w:r>
     </w:p>
     <w:p>
@@ -3270,16 +4001,403 @@
       <w:r>
         <w:tab/>
       </w:r>
-    </w:p>
-    <w:p>
-      <w:pPr>
-        <w:jc w:val="both"/>
-      </w:pPr>
-    </w:p>
-    <w:p>
-      <w:pPr>
-        <w:jc w:val="both"/>
-      </w:pPr>
+      <w:r>
+        <w:t>A</w:t>
+      </w:r>
+      <w:r>
+        <w:t xml:space="preserve">z </w:t>
+      </w:r>
+      <w:r>
+        <w:rPr>
+          <w:b/>
+          <w:bCs/>
+        </w:rPr>
+        <w:t>F1_LINUX-TEAM_A</w:t>
+      </w:r>
+      <w:r>
+        <w:t xml:space="preserve"> </w:t>
+      </w:r>
+      <w:r>
+        <w:t xml:space="preserve">PC az </w:t>
+      </w:r>
+      <w:r>
+        <w:rPr>
+          <w:b/>
+          <w:bCs/>
+        </w:rPr>
+        <w:t>R1_F1</w:t>
+      </w:r>
+      <w:r>
+        <w:t xml:space="preserve"> kiesése után is eltudja érni az internetet.</w:t>
+      </w:r>
+    </w:p>
+    <w:p>
+      <w:pPr>
+        <w:jc w:val="both"/>
+      </w:pPr>
+    </w:p>
+    <w:p>
+      <w:pPr>
+        <w:jc w:val="both"/>
+        <w:rPr>
+          <w:i/>
+          <w:iCs/>
+          <w:u w:val="single"/>
+        </w:rPr>
+      </w:pPr>
+      <w:r>
+        <w:rPr>
+          <w:i/>
+          <w:iCs/>
+          <w:noProof/>
+          <w:u w:val="single"/>
+        </w:rPr>
+        <w:drawing>
+          <wp:anchor distT="0" distB="0" distL="114300" distR="114300" simplePos="0" relativeHeight="251704320" behindDoc="0" locked="0" layoutInCell="1" allowOverlap="1" wp14:anchorId="10628675" wp14:editId="36D7D2EA">
+            <wp:simplePos x="0" y="0"/>
+            <wp:positionH relativeFrom="column">
+              <wp:posOffset>2821940</wp:posOffset>
+            </wp:positionH>
+            <wp:positionV relativeFrom="paragraph">
+              <wp:posOffset>3150870</wp:posOffset>
+            </wp:positionV>
+            <wp:extent cx="3173095" cy="3255645"/>
+            <wp:effectExtent l="0" t="0" r="8255" b="1905"/>
+            <wp:wrapTopAndBottom/>
+            <wp:docPr id="1770036665" name="Kép 54"/>
+            <wp:cNvGraphicFramePr>
+              <a:graphicFrameLocks xmlns:a="http://schemas.openxmlformats.org/drawingml/2006/main" noChangeAspect="1"/>
+            </wp:cNvGraphicFramePr>
+            <a:graphic xmlns:a="http://schemas.openxmlformats.org/drawingml/2006/main">
+              <a:graphicData uri="http://schemas.openxmlformats.org/drawingml/2006/picture">
+                <pic:pic xmlns:pic="http://schemas.openxmlformats.org/drawingml/2006/picture">
+                  <pic:nvPicPr>
+                    <pic:cNvPr id="0" name="Picture 241"/>
+                    <pic:cNvPicPr>
+                      <a:picLocks noChangeAspect="1" noChangeArrowheads="1"/>
+                    </pic:cNvPicPr>
+                  </pic:nvPicPr>
+                  <pic:blipFill>
+                    <a:blip r:embed="rId31">
+                      <a:extLst>
+                        <a:ext uri="{28A0092B-C50C-407E-A947-70E740481C1C}">
+                          <a14:useLocalDpi xmlns:a14="http://schemas.microsoft.com/office/drawing/2010/main" val="0"/>
+                        </a:ext>
+                      </a:extLst>
+                    </a:blip>
+                    <a:srcRect/>
+                    <a:stretch>
+                      <a:fillRect/>
+                    </a:stretch>
+                  </pic:blipFill>
+                  <pic:spPr bwMode="auto">
+                    <a:xfrm>
+                      <a:off x="0" y="0"/>
+                      <a:ext cx="3173095" cy="3255645"/>
+                    </a:xfrm>
+                    <a:prstGeom prst="rect">
+                      <a:avLst/>
+                    </a:prstGeom>
+                    <a:noFill/>
+                    <a:ln>
+                      <a:noFill/>
+                    </a:ln>
+                  </pic:spPr>
+                </pic:pic>
+              </a:graphicData>
+            </a:graphic>
+            <wp14:sizeRelH relativeFrom="margin">
+              <wp14:pctWidth>0</wp14:pctWidth>
+            </wp14:sizeRelH>
+            <wp14:sizeRelV relativeFrom="margin">
+              <wp14:pctHeight>0</wp14:pctHeight>
+            </wp14:sizeRelV>
+          </wp:anchor>
+        </w:drawing>
+      </w:r>
+      <w:r>
+        <w:rPr>
+          <w:i/>
+          <w:iCs/>
+          <w:noProof/>
+          <w:u w:val="single"/>
+        </w:rPr>
+        <w:drawing>
+          <wp:anchor distT="0" distB="0" distL="114300" distR="114300" simplePos="0" relativeHeight="251703296" behindDoc="0" locked="0" layoutInCell="1" allowOverlap="1" wp14:anchorId="2D323A10" wp14:editId="4320F2EC">
+            <wp:simplePos x="0" y="0"/>
+            <wp:positionH relativeFrom="margin">
+              <wp:posOffset>-329565</wp:posOffset>
+            </wp:positionH>
+            <wp:positionV relativeFrom="paragraph">
+              <wp:posOffset>3161665</wp:posOffset>
+            </wp:positionV>
+            <wp:extent cx="3153410" cy="3248025"/>
+            <wp:effectExtent l="0" t="0" r="8890" b="9525"/>
+            <wp:wrapTopAndBottom/>
+            <wp:docPr id="1672294757" name="Kép 53"/>
+            <wp:cNvGraphicFramePr>
+              <a:graphicFrameLocks xmlns:a="http://schemas.openxmlformats.org/drawingml/2006/main" noChangeAspect="1"/>
+            </wp:cNvGraphicFramePr>
+            <a:graphic xmlns:a="http://schemas.openxmlformats.org/drawingml/2006/main">
+              <a:graphicData uri="http://schemas.openxmlformats.org/drawingml/2006/picture">
+                <pic:pic xmlns:pic="http://schemas.openxmlformats.org/drawingml/2006/picture">
+                  <pic:nvPicPr>
+                    <pic:cNvPr id="0" name="Picture 240"/>
+                    <pic:cNvPicPr>
+                      <a:picLocks noChangeAspect="1" noChangeArrowheads="1"/>
+                    </pic:cNvPicPr>
+                  </pic:nvPicPr>
+                  <pic:blipFill>
+                    <a:blip r:embed="rId32">
+                      <a:extLst>
+                        <a:ext uri="{28A0092B-C50C-407E-A947-70E740481C1C}">
+                          <a14:useLocalDpi xmlns:a14="http://schemas.microsoft.com/office/drawing/2010/main" val="0"/>
+                        </a:ext>
+                      </a:extLst>
+                    </a:blip>
+                    <a:srcRect/>
+                    <a:stretch>
+                      <a:fillRect/>
+                    </a:stretch>
+                  </pic:blipFill>
+                  <pic:spPr bwMode="auto">
+                    <a:xfrm>
+                      <a:off x="0" y="0"/>
+                      <a:ext cx="3153410" cy="3248025"/>
+                    </a:xfrm>
+                    <a:prstGeom prst="rect">
+                      <a:avLst/>
+                    </a:prstGeom>
+                    <a:noFill/>
+                    <a:ln>
+                      <a:noFill/>
+                    </a:ln>
+                  </pic:spPr>
+                </pic:pic>
+              </a:graphicData>
+            </a:graphic>
+            <wp14:sizeRelH relativeFrom="margin">
+              <wp14:pctWidth>0</wp14:pctWidth>
+            </wp14:sizeRelH>
+            <wp14:sizeRelV relativeFrom="margin">
+              <wp14:pctHeight>0</wp14:pctHeight>
+            </wp14:sizeRelV>
+          </wp:anchor>
+        </w:drawing>
+      </w:r>
+      <w:r>
+        <w:rPr>
+          <w:i/>
+          <w:iCs/>
+          <w:noProof/>
+          <w:u w:val="single"/>
+        </w:rPr>
+        <w:drawing>
+          <wp:anchor distT="0" distB="0" distL="114300" distR="114300" simplePos="0" relativeHeight="251702272" behindDoc="0" locked="0" layoutInCell="1" allowOverlap="1" wp14:anchorId="28A6265F" wp14:editId="10C332AD">
+            <wp:simplePos x="0" y="0"/>
+            <wp:positionH relativeFrom="column">
+              <wp:posOffset>1326627</wp:posOffset>
+            </wp:positionH>
+            <wp:positionV relativeFrom="paragraph">
+              <wp:posOffset>278915</wp:posOffset>
+            </wp:positionV>
+            <wp:extent cx="2764790" cy="2847340"/>
+            <wp:effectExtent l="0" t="0" r="0" b="0"/>
+            <wp:wrapTopAndBottom/>
+            <wp:docPr id="1796965162" name="Kép 52"/>
+            <wp:cNvGraphicFramePr>
+              <a:graphicFrameLocks xmlns:a="http://schemas.openxmlformats.org/drawingml/2006/main" noChangeAspect="1"/>
+            </wp:cNvGraphicFramePr>
+            <a:graphic xmlns:a="http://schemas.openxmlformats.org/drawingml/2006/main">
+              <a:graphicData uri="http://schemas.openxmlformats.org/drawingml/2006/picture">
+                <pic:pic xmlns:pic="http://schemas.openxmlformats.org/drawingml/2006/picture">
+                  <pic:nvPicPr>
+                    <pic:cNvPr id="0" name="Picture 239"/>
+                    <pic:cNvPicPr>
+                      <a:picLocks noChangeAspect="1" noChangeArrowheads="1"/>
+                    </pic:cNvPicPr>
+                  </pic:nvPicPr>
+                  <pic:blipFill>
+                    <a:blip r:embed="rId33" cstate="print">
+                      <a:extLst>
+                        <a:ext uri="{28A0092B-C50C-407E-A947-70E740481C1C}">
+                          <a14:useLocalDpi xmlns:a14="http://schemas.microsoft.com/office/drawing/2010/main" val="0"/>
+                        </a:ext>
+                      </a:extLst>
+                    </a:blip>
+                    <a:srcRect/>
+                    <a:stretch>
+                      <a:fillRect/>
+                    </a:stretch>
+                  </pic:blipFill>
+                  <pic:spPr bwMode="auto">
+                    <a:xfrm>
+                      <a:off x="0" y="0"/>
+                      <a:ext cx="2764790" cy="2847340"/>
+                    </a:xfrm>
+                    <a:prstGeom prst="rect">
+                      <a:avLst/>
+                    </a:prstGeom>
+                    <a:noFill/>
+                    <a:ln>
+                      <a:noFill/>
+                    </a:ln>
+                  </pic:spPr>
+                </pic:pic>
+              </a:graphicData>
+            </a:graphic>
+          </wp:anchor>
+        </w:drawing>
+      </w:r>
+      <w:r>
+        <w:rPr>
+          <w:i/>
+          <w:iCs/>
+          <w:u w:val="single"/>
+        </w:rPr>
+        <w:t>Helyreállítás:</w:t>
+      </w:r>
+    </w:p>
+    <w:p>
+      <w:pPr>
+        <w:jc w:val="both"/>
+      </w:pPr>
+      <w:r>
+        <w:tab/>
+      </w:r>
+    </w:p>
+    <w:p>
+      <w:pPr>
+        <w:jc w:val="both"/>
+      </w:pPr>
+    </w:p>
+    <w:p>
+      <w:pPr>
+        <w:jc w:val="both"/>
+      </w:pPr>
+      <w:r>
+        <w:rPr>
+          <w:noProof/>
+        </w:rPr>
+        <w:lastRenderedPageBreak/>
+        <w:drawing>
+          <wp:anchor distT="0" distB="0" distL="114300" distR="114300" simplePos="0" relativeHeight="251705344" behindDoc="0" locked="0" layoutInCell="1" allowOverlap="1" wp14:anchorId="5F221237" wp14:editId="0478C148">
+            <wp:simplePos x="0" y="0"/>
+            <wp:positionH relativeFrom="margin">
+              <wp:posOffset>-344170</wp:posOffset>
+            </wp:positionH>
+            <wp:positionV relativeFrom="paragraph">
+              <wp:posOffset>10160</wp:posOffset>
+            </wp:positionV>
+            <wp:extent cx="3162300" cy="3244850"/>
+            <wp:effectExtent l="0" t="0" r="0" b="0"/>
+            <wp:wrapTopAndBottom/>
+            <wp:docPr id="1036448303" name="Kép 55"/>
+            <wp:cNvGraphicFramePr>
+              <a:graphicFrameLocks xmlns:a="http://schemas.openxmlformats.org/drawingml/2006/main" noChangeAspect="1"/>
+            </wp:cNvGraphicFramePr>
+            <a:graphic xmlns:a="http://schemas.openxmlformats.org/drawingml/2006/main">
+              <a:graphicData uri="http://schemas.openxmlformats.org/drawingml/2006/picture">
+                <pic:pic xmlns:pic="http://schemas.openxmlformats.org/drawingml/2006/picture">
+                  <pic:nvPicPr>
+                    <pic:cNvPr id="0" name="Picture 242"/>
+                    <pic:cNvPicPr>
+                      <a:picLocks noChangeAspect="1" noChangeArrowheads="1"/>
+                    </pic:cNvPicPr>
+                  </pic:nvPicPr>
+                  <pic:blipFill>
+                    <a:blip r:embed="rId34">
+                      <a:extLst>
+                        <a:ext uri="{28A0092B-C50C-407E-A947-70E740481C1C}">
+                          <a14:useLocalDpi xmlns:a14="http://schemas.microsoft.com/office/drawing/2010/main" val="0"/>
+                        </a:ext>
+                      </a:extLst>
+                    </a:blip>
+                    <a:srcRect/>
+                    <a:stretch>
+                      <a:fillRect/>
+                    </a:stretch>
+                  </pic:blipFill>
+                  <pic:spPr bwMode="auto">
+                    <a:xfrm>
+                      <a:off x="0" y="0"/>
+                      <a:ext cx="3162300" cy="3244850"/>
+                    </a:xfrm>
+                    <a:prstGeom prst="rect">
+                      <a:avLst/>
+                    </a:prstGeom>
+                    <a:noFill/>
+                    <a:ln>
+                      <a:noFill/>
+                    </a:ln>
+                  </pic:spPr>
+                </pic:pic>
+              </a:graphicData>
+            </a:graphic>
+          </wp:anchor>
+        </w:drawing>
+      </w:r>
+      <w:r>
+        <w:rPr>
+          <w:noProof/>
+        </w:rPr>
+        <w:drawing>
+          <wp:anchor distT="0" distB="0" distL="114300" distR="114300" simplePos="0" relativeHeight="251706368" behindDoc="0" locked="0" layoutInCell="1" allowOverlap="1" wp14:anchorId="7FC85133" wp14:editId="73D3C4A2">
+            <wp:simplePos x="0" y="0"/>
+            <wp:positionH relativeFrom="column">
+              <wp:posOffset>2821305</wp:posOffset>
+            </wp:positionH>
+            <wp:positionV relativeFrom="paragraph">
+              <wp:posOffset>37</wp:posOffset>
+            </wp:positionV>
+            <wp:extent cx="3164840" cy="3259455"/>
+            <wp:effectExtent l="0" t="0" r="0" b="0"/>
+            <wp:wrapTopAndBottom/>
+            <wp:docPr id="147038984" name="Kép 56"/>
+            <wp:cNvGraphicFramePr>
+              <a:graphicFrameLocks xmlns:a="http://schemas.openxmlformats.org/drawingml/2006/main" noChangeAspect="1"/>
+            </wp:cNvGraphicFramePr>
+            <a:graphic xmlns:a="http://schemas.openxmlformats.org/drawingml/2006/main">
+              <a:graphicData uri="http://schemas.openxmlformats.org/drawingml/2006/picture">
+                <pic:pic xmlns:pic="http://schemas.openxmlformats.org/drawingml/2006/picture">
+                  <pic:nvPicPr>
+                    <pic:cNvPr id="0" name="Picture 243"/>
+                    <pic:cNvPicPr>
+                      <a:picLocks noChangeAspect="1" noChangeArrowheads="1"/>
+                    </pic:cNvPicPr>
+                  </pic:nvPicPr>
+                  <pic:blipFill>
+                    <a:blip r:embed="rId35">
+                      <a:extLst>
+                        <a:ext uri="{28A0092B-C50C-407E-A947-70E740481C1C}">
+                          <a14:useLocalDpi xmlns:a14="http://schemas.microsoft.com/office/drawing/2010/main" val="0"/>
+                        </a:ext>
+                      </a:extLst>
+                    </a:blip>
+                    <a:srcRect/>
+                    <a:stretch>
+                      <a:fillRect/>
+                    </a:stretch>
+                  </pic:blipFill>
+                  <pic:spPr bwMode="auto">
+                    <a:xfrm>
+                      <a:off x="0" y="0"/>
+                      <a:ext cx="3164840" cy="3259455"/>
+                    </a:xfrm>
+                    <a:prstGeom prst="rect">
+                      <a:avLst/>
+                    </a:prstGeom>
+                    <a:noFill/>
+                    <a:ln>
+                      <a:noFill/>
+                    </a:ln>
+                  </pic:spPr>
+                </pic:pic>
+              </a:graphicData>
+            </a:graphic>
+          </wp:anchor>
+        </w:drawing>
+      </w:r>
     </w:p>
     <w:p>
       <w:r>
@@ -3313,7 +4431,6 @@
           <w:szCs w:val="44"/>
           <w:u w:val="single"/>
         </w:rPr>
-        <w:lastRenderedPageBreak/>
         <w:t>OS</w:t>
       </w:r>
       <w:r>
@@ -3526,19 +4643,87 @@
         <w:t xml:space="preserve"> </w:t>
       </w:r>
       <w:r>
-        <w:t>a ping-et, amit az ANDOR_GRNDFLR_A PC indít az F1_LINUX-TEAM_A PC felé, az ANDOR_R -en konfigurált OSPF tudni fogja, hogy merre kell majd küldeni és ezeket a az utakat meg is fogjuk nézni.</w:t>
-      </w:r>
-    </w:p>
-    <w:p>
-      <w:pPr>
-        <w:jc w:val="both"/>
-      </w:pPr>
-    </w:p>
-    <w:p>
-      <w:pPr>
-        <w:jc w:val="both"/>
-      </w:pPr>
-      <w:r>
+        <w:t xml:space="preserve">a </w:t>
+      </w:r>
+      <w:r>
+        <w:rPr>
+          <w:i/>
+          <w:iCs/>
+        </w:rPr>
+        <w:t>ping</w:t>
+      </w:r>
+      <w:r>
+        <w:t>-</w:t>
+      </w:r>
+      <w:proofErr w:type="spellStart"/>
+      <w:r>
+        <w:t>et</w:t>
+      </w:r>
+      <w:proofErr w:type="spellEnd"/>
+      <w:r>
+        <w:t xml:space="preserve">, amit az </w:t>
+      </w:r>
+      <w:r>
+        <w:rPr>
+          <w:b/>
+          <w:bCs/>
+        </w:rPr>
+        <w:t>ANDOR_GRNDFLR_A</w:t>
+      </w:r>
+      <w:r>
+        <w:t xml:space="preserve"> PC indít az </w:t>
+      </w:r>
+      <w:r>
+        <w:rPr>
+          <w:b/>
+          <w:bCs/>
+        </w:rPr>
+        <w:t>F1_LINUX-TEAM_A PC</w:t>
+      </w:r>
+      <w:r>
+        <w:t xml:space="preserve"> felé, az </w:t>
+      </w:r>
+      <w:r>
+        <w:rPr>
+          <w:b/>
+          <w:bCs/>
+        </w:rPr>
+        <w:t>ANDOR_R</w:t>
+      </w:r>
+      <w:r>
+        <w:t xml:space="preserve"> -en konfigurált </w:t>
+      </w:r>
+      <w:r>
+        <w:rPr>
+          <w:b/>
+          <w:bCs/>
+        </w:rPr>
+        <w:t>OSPF</w:t>
+      </w:r>
+      <w:r>
+        <w:t xml:space="preserve"> tudni fogja, hogy merre kell majd küldeni és ezeket az utakat meg is fogjuk nézni.</w:t>
+      </w:r>
+    </w:p>
+    <w:p>
+      <w:pPr>
+        <w:jc w:val="both"/>
+      </w:pPr>
+    </w:p>
+    <w:p>
+      <w:pPr>
+        <w:jc w:val="both"/>
+        <w:rPr>
+          <w:i/>
+          <w:iCs/>
+          <w:u w:val="single"/>
+        </w:rPr>
+      </w:pPr>
+      <w:r>
+        <w:rPr>
+          <w:i/>
+          <w:iCs/>
+          <w:u w:val="single"/>
+        </w:rPr>
         <w:t>Teszt várt eredménye:</w:t>
       </w:r>
     </w:p>
@@ -3550,25 +4735,325 @@
         <w:tab/>
       </w:r>
       <w:r>
-        <w:t>A ping oda és visszafelé is gond nélkül el fog jutni a céljába az OSPF forgalomirányításának köszönhetően.</w:t>
-      </w:r>
-    </w:p>
-    <w:p>
-      <w:pPr>
-        <w:jc w:val="both"/>
-      </w:pPr>
-    </w:p>
-    <w:p>
-      <w:pPr>
-        <w:jc w:val="both"/>
-      </w:pPr>
-    </w:p>
-    <w:p>
-      <w:pPr>
-        <w:jc w:val="both"/>
-      </w:pPr>
-      <w:r>
-        <w:t>A teszt eredménye – SIKERES/SIKERTEKLEN</w:t>
+        <w:t xml:space="preserve">A </w:t>
+      </w:r>
+      <w:r>
+        <w:rPr>
+          <w:i/>
+          <w:iCs/>
+        </w:rPr>
+        <w:t>ping</w:t>
+      </w:r>
+      <w:r>
+        <w:t xml:space="preserve"> oda és visszafelé is gond nélkül el fog jutni a céljába az </w:t>
+      </w:r>
+      <w:r>
+        <w:rPr>
+          <w:b/>
+          <w:bCs/>
+        </w:rPr>
+        <w:t>OSPF</w:t>
+      </w:r>
+      <w:r>
+        <w:t xml:space="preserve"> </w:t>
+      </w:r>
+      <w:r>
+        <w:rPr>
+          <w:i/>
+          <w:iCs/>
+        </w:rPr>
+        <w:t>forgalomirányításának</w:t>
+      </w:r>
+      <w:r>
+        <w:t xml:space="preserve"> </w:t>
+      </w:r>
+      <w:r>
+        <w:t>köszönhetően.</w:t>
+      </w:r>
+    </w:p>
+    <w:p>
+      <w:pPr>
+        <w:jc w:val="both"/>
+      </w:pPr>
+      <w:r>
+        <w:rPr>
+          <w:noProof/>
+        </w:rPr>
+        <w:lastRenderedPageBreak/>
+        <w:drawing>
+          <wp:anchor distT="0" distB="0" distL="114300" distR="114300" simplePos="0" relativeHeight="251685888" behindDoc="0" locked="0" layoutInCell="1" allowOverlap="1" wp14:anchorId="668125B8" wp14:editId="7687740A">
+            <wp:simplePos x="0" y="0"/>
+            <wp:positionH relativeFrom="margin">
+              <wp:align>center</wp:align>
+            </wp:positionH>
+            <wp:positionV relativeFrom="paragraph">
+              <wp:posOffset>4231005</wp:posOffset>
+            </wp:positionV>
+            <wp:extent cx="3661410" cy="3743325"/>
+            <wp:effectExtent l="0" t="0" r="0" b="9525"/>
+            <wp:wrapTopAndBottom/>
+            <wp:docPr id="457046646" name="Kép 30"/>
+            <wp:cNvGraphicFramePr>
+              <a:graphicFrameLocks xmlns:a="http://schemas.openxmlformats.org/drawingml/2006/main" noChangeAspect="1"/>
+            </wp:cNvGraphicFramePr>
+            <a:graphic xmlns:a="http://schemas.openxmlformats.org/drawingml/2006/main">
+              <a:graphicData uri="http://schemas.openxmlformats.org/drawingml/2006/picture">
+                <pic:pic xmlns:pic="http://schemas.openxmlformats.org/drawingml/2006/picture">
+                  <pic:nvPicPr>
+                    <pic:cNvPr id="0" name="Picture 190"/>
+                    <pic:cNvPicPr>
+                      <a:picLocks noChangeAspect="1" noChangeArrowheads="1"/>
+                    </pic:cNvPicPr>
+                  </pic:nvPicPr>
+                  <pic:blipFill>
+                    <a:blip r:embed="rId36">
+                      <a:extLst>
+                        <a:ext uri="{28A0092B-C50C-407E-A947-70E740481C1C}">
+                          <a14:useLocalDpi xmlns:a14="http://schemas.microsoft.com/office/drawing/2010/main" val="0"/>
+                        </a:ext>
+                      </a:extLst>
+                    </a:blip>
+                    <a:srcRect/>
+                    <a:stretch>
+                      <a:fillRect/>
+                    </a:stretch>
+                  </pic:blipFill>
+                  <pic:spPr bwMode="auto">
+                    <a:xfrm>
+                      <a:off x="0" y="0"/>
+                      <a:ext cx="3661410" cy="3743325"/>
+                    </a:xfrm>
+                    <a:prstGeom prst="rect">
+                      <a:avLst/>
+                    </a:prstGeom>
+                    <a:noFill/>
+                    <a:ln>
+                      <a:noFill/>
+                    </a:ln>
+                  </pic:spPr>
+                </pic:pic>
+              </a:graphicData>
+            </a:graphic>
+            <wp14:sizeRelH relativeFrom="margin">
+              <wp14:pctWidth>0</wp14:pctWidth>
+            </wp14:sizeRelH>
+            <wp14:sizeRelV relativeFrom="margin">
+              <wp14:pctHeight>0</wp14:pctHeight>
+            </wp14:sizeRelV>
+          </wp:anchor>
+        </w:drawing>
+      </w:r>
+      <w:r>
+        <w:rPr>
+          <w:noProof/>
+        </w:rPr>
+        <w:drawing>
+          <wp:anchor distT="0" distB="0" distL="114300" distR="114300" simplePos="0" relativeHeight="251684864" behindDoc="0" locked="0" layoutInCell="1" allowOverlap="1" wp14:anchorId="5E406A7A" wp14:editId="12D58476">
+            <wp:simplePos x="0" y="0"/>
+            <wp:positionH relativeFrom="margin">
+              <wp:posOffset>1058097</wp:posOffset>
+            </wp:positionH>
+            <wp:positionV relativeFrom="paragraph">
+              <wp:posOffset>336625</wp:posOffset>
+            </wp:positionV>
+            <wp:extent cx="3644900" cy="3754120"/>
+            <wp:effectExtent l="0" t="0" r="0" b="0"/>
+            <wp:wrapTopAndBottom/>
+            <wp:docPr id="91730790" name="Kép 29"/>
+            <wp:cNvGraphicFramePr>
+              <a:graphicFrameLocks xmlns:a="http://schemas.openxmlformats.org/drawingml/2006/main" noChangeAspect="1"/>
+            </wp:cNvGraphicFramePr>
+            <a:graphic xmlns:a="http://schemas.openxmlformats.org/drawingml/2006/main">
+              <a:graphicData uri="http://schemas.openxmlformats.org/drawingml/2006/picture">
+                <pic:pic xmlns:pic="http://schemas.openxmlformats.org/drawingml/2006/picture">
+                  <pic:nvPicPr>
+                    <pic:cNvPr id="0" name="Picture 189"/>
+                    <pic:cNvPicPr>
+                      <a:picLocks noChangeAspect="1" noChangeArrowheads="1"/>
+                    </pic:cNvPicPr>
+                  </pic:nvPicPr>
+                  <pic:blipFill>
+                    <a:blip r:embed="rId37">
+                      <a:extLst>
+                        <a:ext uri="{28A0092B-C50C-407E-A947-70E740481C1C}">
+                          <a14:useLocalDpi xmlns:a14="http://schemas.microsoft.com/office/drawing/2010/main" val="0"/>
+                        </a:ext>
+                      </a:extLst>
+                    </a:blip>
+                    <a:srcRect/>
+                    <a:stretch>
+                      <a:fillRect/>
+                    </a:stretch>
+                  </pic:blipFill>
+                  <pic:spPr bwMode="auto">
+                    <a:xfrm>
+                      <a:off x="0" y="0"/>
+                      <a:ext cx="3644900" cy="3754120"/>
+                    </a:xfrm>
+                    <a:prstGeom prst="rect">
+                      <a:avLst/>
+                    </a:prstGeom>
+                    <a:noFill/>
+                    <a:ln>
+                      <a:noFill/>
+                    </a:ln>
+                  </pic:spPr>
+                </pic:pic>
+              </a:graphicData>
+            </a:graphic>
+          </wp:anchor>
+        </w:drawing>
+      </w:r>
+    </w:p>
+    <w:p>
+      <w:pPr>
+        <w:jc w:val="both"/>
+      </w:pPr>
+    </w:p>
+    <w:p>
+      <w:pPr>
+        <w:jc w:val="both"/>
+      </w:pPr>
+      <w:r>
+        <w:rPr>
+          <w:noProof/>
+        </w:rPr>
+        <w:lastRenderedPageBreak/>
+        <w:drawing>
+          <wp:anchor distT="0" distB="0" distL="114300" distR="114300" simplePos="0" relativeHeight="251687936" behindDoc="0" locked="0" layoutInCell="1" allowOverlap="1" wp14:anchorId="45736F0D" wp14:editId="45064031">
+            <wp:simplePos x="0" y="0"/>
+            <wp:positionH relativeFrom="margin">
+              <wp:posOffset>782357</wp:posOffset>
+            </wp:positionH>
+            <wp:positionV relativeFrom="paragraph">
+              <wp:posOffset>2982408</wp:posOffset>
+            </wp:positionV>
+            <wp:extent cx="4152265" cy="1667510"/>
+            <wp:effectExtent l="0" t="0" r="635" b="8890"/>
+            <wp:wrapTopAndBottom/>
+            <wp:docPr id="2144446061" name="Kép 32"/>
+            <wp:cNvGraphicFramePr>
+              <a:graphicFrameLocks xmlns:a="http://schemas.openxmlformats.org/drawingml/2006/main" noChangeAspect="1"/>
+            </wp:cNvGraphicFramePr>
+            <a:graphic xmlns:a="http://schemas.openxmlformats.org/drawingml/2006/main">
+              <a:graphicData uri="http://schemas.openxmlformats.org/drawingml/2006/picture">
+                <pic:pic xmlns:pic="http://schemas.openxmlformats.org/drawingml/2006/picture">
+                  <pic:nvPicPr>
+                    <pic:cNvPr id="0" name="Picture 194"/>
+                    <pic:cNvPicPr>
+                      <a:picLocks noChangeAspect="1" noChangeArrowheads="1"/>
+                    </pic:cNvPicPr>
+                  </pic:nvPicPr>
+                  <pic:blipFill>
+                    <a:blip r:embed="rId38">
+                      <a:extLst>
+                        <a:ext uri="{28A0092B-C50C-407E-A947-70E740481C1C}">
+                          <a14:useLocalDpi xmlns:a14="http://schemas.microsoft.com/office/drawing/2010/main" val="0"/>
+                        </a:ext>
+                      </a:extLst>
+                    </a:blip>
+                    <a:srcRect/>
+                    <a:stretch>
+                      <a:fillRect/>
+                    </a:stretch>
+                  </pic:blipFill>
+                  <pic:spPr bwMode="auto">
+                    <a:xfrm>
+                      <a:off x="0" y="0"/>
+                      <a:ext cx="4152265" cy="1667510"/>
+                    </a:xfrm>
+                    <a:prstGeom prst="rect">
+                      <a:avLst/>
+                    </a:prstGeom>
+                    <a:noFill/>
+                    <a:ln>
+                      <a:noFill/>
+                    </a:ln>
+                  </pic:spPr>
+                </pic:pic>
+              </a:graphicData>
+            </a:graphic>
+          </wp:anchor>
+        </w:drawing>
+      </w:r>
+      <w:r>
+        <w:rPr>
+          <w:noProof/>
+        </w:rPr>
+        <w:drawing>
+          <wp:anchor distT="0" distB="0" distL="114300" distR="114300" simplePos="0" relativeHeight="251686912" behindDoc="0" locked="0" layoutInCell="1" allowOverlap="1" wp14:anchorId="0EF43E7F" wp14:editId="59A4C423">
+            <wp:simplePos x="0" y="0"/>
+            <wp:positionH relativeFrom="margin">
+              <wp:align>center</wp:align>
+            </wp:positionH>
+            <wp:positionV relativeFrom="paragraph">
+              <wp:posOffset>10758</wp:posOffset>
+            </wp:positionV>
+            <wp:extent cx="5755640" cy="2947670"/>
+            <wp:effectExtent l="0" t="0" r="0" b="5080"/>
+            <wp:wrapTopAndBottom/>
+            <wp:docPr id="1060018424" name="Kép 31"/>
+            <wp:cNvGraphicFramePr>
+              <a:graphicFrameLocks xmlns:a="http://schemas.openxmlformats.org/drawingml/2006/main" noChangeAspect="1"/>
+            </wp:cNvGraphicFramePr>
+            <a:graphic xmlns:a="http://schemas.openxmlformats.org/drawingml/2006/main">
+              <a:graphicData uri="http://schemas.openxmlformats.org/drawingml/2006/picture">
+                <pic:pic xmlns:pic="http://schemas.openxmlformats.org/drawingml/2006/picture">
+                  <pic:nvPicPr>
+                    <pic:cNvPr id="0" name="Picture 193"/>
+                    <pic:cNvPicPr>
+                      <a:picLocks noChangeAspect="1" noChangeArrowheads="1"/>
+                    </pic:cNvPicPr>
+                  </pic:nvPicPr>
+                  <pic:blipFill>
+                    <a:blip r:embed="rId39" cstate="print">
+                      <a:extLst>
+                        <a:ext uri="{28A0092B-C50C-407E-A947-70E740481C1C}">
+                          <a14:useLocalDpi xmlns:a14="http://schemas.microsoft.com/office/drawing/2010/main" val="0"/>
+                        </a:ext>
+                      </a:extLst>
+                    </a:blip>
+                    <a:srcRect/>
+                    <a:stretch>
+                      <a:fillRect/>
+                    </a:stretch>
+                  </pic:blipFill>
+                  <pic:spPr bwMode="auto">
+                    <a:xfrm>
+                      <a:off x="0" y="0"/>
+                      <a:ext cx="5755640" cy="2947670"/>
+                    </a:xfrm>
+                    <a:prstGeom prst="rect">
+                      <a:avLst/>
+                    </a:prstGeom>
+                    <a:noFill/>
+                    <a:ln>
+                      <a:noFill/>
+                    </a:ln>
+                  </pic:spPr>
+                </pic:pic>
+              </a:graphicData>
+            </a:graphic>
+          </wp:anchor>
+        </w:drawing>
+      </w:r>
+    </w:p>
+    <w:p>
+      <w:pPr>
+        <w:jc w:val="both"/>
+        <w:rPr>
+          <w:i/>
+          <w:iCs/>
+          <w:u w:val="single"/>
+        </w:rPr>
+      </w:pPr>
+      <w:r>
+        <w:rPr>
+          <w:i/>
+          <w:iCs/>
+          <w:u w:val="single"/>
+        </w:rPr>
+        <w:t>A teszt eredménye – SIKERES</w:t>
       </w:r>
     </w:p>
     <w:p>
@@ -3578,11 +5063,35 @@
       <w:r>
         <w:tab/>
       </w:r>
-    </w:p>
-    <w:p>
-      <w:pPr>
-        <w:jc w:val="both"/>
-      </w:pPr>
+      <w:r>
+        <w:t xml:space="preserve">A teszt sikeres volt, és a </w:t>
+      </w:r>
+      <w:r>
+        <w:rPr>
+          <w:i/>
+          <w:iCs/>
+        </w:rPr>
+        <w:t>ping</w:t>
+      </w:r>
+      <w:r>
+        <w:t xml:space="preserve"> megtette az oda-vissza utat gond nélkül és a táblákon pedig látszik, hogy az </w:t>
+      </w:r>
+      <w:r>
+        <w:rPr>
+          <w:i/>
+          <w:iCs/>
+        </w:rPr>
+        <w:t>összes többi routert</w:t>
+      </w:r>
+      <w:r>
+        <w:t xml:space="preserve"> is </w:t>
+      </w:r>
+      <w:r>
+        <w:t>látja,</w:t>
+      </w:r>
+      <w:r>
+        <w:t xml:space="preserve"> amelyek benne vannak a topológiában.</w:t>
+      </w:r>
     </w:p>
     <w:p>
       <w:pPr>
@@ -3648,9 +5157,6 @@
         <w:tab/>
       </w:r>
       <w:r>
-        <w:tab/>
-      </w:r>
-      <w:r>
         <w:t>A</w:t>
       </w:r>
       <w:r>
@@ -3690,6 +5196,10 @@
         <w:t xml:space="preserve">tesztelésén át fogjuk szemléltetni </w:t>
       </w:r>
       <w:r>
+        <w:rPr>
+          <w:i/>
+          <w:iCs/>
+        </w:rPr>
         <w:t>távolról való elérés</w:t>
       </w:r>
       <w:r>
@@ -3762,25 +5272,25 @@
           <w:bCs/>
           <w:noProof/>
         </w:rPr>
+        <w:t>ANDOR_R</w:t>
+      </w:r>
+    </w:p>
+    <w:p>
+      <w:pPr>
+        <w:jc w:val="both"/>
+        <w:rPr>
+          <w:i/>
+          <w:iCs/>
+          <w:u w:val="single"/>
+        </w:rPr>
+      </w:pPr>
+      <w:r>
+        <w:rPr>
+          <w:i/>
+          <w:iCs/>
+          <w:u w:val="single"/>
+        </w:rPr>
         <w:lastRenderedPageBreak/>
-        <w:t>ANDOR_R</w:t>
-      </w:r>
-    </w:p>
-    <w:p>
-      <w:pPr>
-        <w:jc w:val="both"/>
-        <w:rPr>
-          <w:i/>
-          <w:iCs/>
-          <w:u w:val="single"/>
-        </w:rPr>
-      </w:pPr>
-      <w:r>
-        <w:rPr>
-          <w:i/>
-          <w:iCs/>
-          <w:u w:val="single"/>
-        </w:rPr>
         <w:t>Teszt menete:</w:t>
       </w:r>
     </w:p>
@@ -3854,24 +5364,21 @@
         <w:jc w:val="both"/>
       </w:pPr>
       <w:r>
-        <w:tab/>
-      </w:r>
-      <w:r>
-        <w:t>A távoli router kérni fogja a megadott felhasználónévhez tartozó jelszavat, aminek a megadása után létrejön a kapcsolat, amin keresztül már tudjuk távolról konfigurálni az eszközt.</w:t>
-      </w:r>
-    </w:p>
-    <w:p>
-      <w:pPr>
-        <w:jc w:val="both"/>
-      </w:pPr>
-      <w:r>
         <w:rPr>
           <w:noProof/>
         </w:rPr>
         <w:drawing>
-          <wp:inline distT="0" distB="0" distL="0" distR="0" wp14:anchorId="256AB12C" wp14:editId="1E0B4064">
+          <wp:anchor distT="0" distB="0" distL="114300" distR="114300" simplePos="0" relativeHeight="251707392" behindDoc="0" locked="0" layoutInCell="1" allowOverlap="1" wp14:anchorId="256AB12C" wp14:editId="406CD409">
+            <wp:simplePos x="0" y="0"/>
+            <wp:positionH relativeFrom="margin">
+              <wp:align>center</wp:align>
+            </wp:positionH>
+            <wp:positionV relativeFrom="paragraph">
+              <wp:posOffset>692412</wp:posOffset>
+            </wp:positionV>
             <wp:extent cx="3775934" cy="3909659"/>
             <wp:effectExtent l="0" t="0" r="0" b="0"/>
+            <wp:wrapTopAndBottom/>
             <wp:docPr id="1835662574" name="Kép 17"/>
             <wp:cNvGraphicFramePr>
               <a:graphicFrameLocks xmlns:a="http://schemas.openxmlformats.org/drawingml/2006/main" noChangeAspect="1"/>
@@ -3886,7 +5393,7 @@
                     </pic:cNvPicPr>
                   </pic:nvPicPr>
                   <pic:blipFill>
-                    <a:blip r:embed="rId25">
+                    <a:blip r:embed="rId40">
                       <a:extLst>
                         <a:ext uri="{28A0092B-C50C-407E-A947-70E740481C1C}">
                           <a14:useLocalDpi xmlns:a14="http://schemas.microsoft.com/office/drawing/2010/main" val="0"/>
@@ -3901,7 +5408,7 @@
                   <pic:spPr bwMode="auto">
                     <a:xfrm>
                       <a:off x="0" y="0"/>
-                      <a:ext cx="3784081" cy="3918094"/>
+                      <a:ext cx="3775934" cy="3909659"/>
                     </a:xfrm>
                     <a:prstGeom prst="rect">
                       <a:avLst/>
@@ -3914,8 +5421,14 @@
                 </pic:pic>
               </a:graphicData>
             </a:graphic>
-          </wp:inline>
+          </wp:anchor>
         </w:drawing>
+      </w:r>
+      <w:r>
+        <w:tab/>
+      </w:r>
+      <w:r>
+        <w:t>A távoli router kérni fogja a megadott felhasználónévhez tartozó jelszavat, aminek a megadása után létrejön a kapcsolat, amin keresztül már tudjuk távolról konfigurálni az eszközt.</w:t>
       </w:r>
     </w:p>
     <w:p>
@@ -4077,9 +5590,6 @@
       <w:pPr>
         <w:jc w:val="both"/>
       </w:pPr>
-      <w:r>
-        <w:tab/>
-      </w:r>
       <w:r>
         <w:tab/>
       </w:r>
@@ -4182,7 +5692,7 @@
                     </pic:cNvPicPr>
                   </pic:nvPicPr>
                   <pic:blipFill>
-                    <a:blip r:embed="rId26">
+                    <a:blip r:embed="rId41">
                       <a:extLst>
                         <a:ext uri="{28A0092B-C50C-407E-A947-70E740481C1C}">
                           <a14:useLocalDpi xmlns:a14="http://schemas.microsoft.com/office/drawing/2010/main" val="0"/>
@@ -4554,7 +6064,7 @@
                     </pic:cNvPicPr>
                   </pic:nvPicPr>
                   <pic:blipFill rotWithShape="1">
-                    <a:blip r:embed="rId27">
+                    <a:blip r:embed="rId42">
                       <a:extLst>
                         <a:ext uri="{28A0092B-C50C-407E-A947-70E740481C1C}">
                           <a14:useLocalDpi xmlns:a14="http://schemas.microsoft.com/office/drawing/2010/main" val="0"/>
@@ -4617,7 +6127,7 @@
                     </pic:cNvPicPr>
                   </pic:nvPicPr>
                   <pic:blipFill rotWithShape="1">
-                    <a:blip r:embed="rId28">
+                    <a:blip r:embed="rId43">
                       <a:extLst>
                         <a:ext uri="{28A0092B-C50C-407E-A947-70E740481C1C}">
                           <a14:useLocalDpi xmlns:a14="http://schemas.microsoft.com/office/drawing/2010/main" val="0"/>
@@ -4682,7 +6192,7 @@
                     </pic:cNvPicPr>
                   </pic:nvPicPr>
                   <pic:blipFill>
-                    <a:blip r:embed="rId29" cstate="print">
+                    <a:blip r:embed="rId44" cstate="print">
                       <a:extLst>
                         <a:ext uri="{28A0092B-C50C-407E-A947-70E740481C1C}">
                           <a14:useLocalDpi xmlns:a14="http://schemas.microsoft.com/office/drawing/2010/main" val="0"/>
@@ -4754,7 +6264,7 @@
                     </pic:cNvPicPr>
                   </pic:nvPicPr>
                   <pic:blipFill>
-                    <a:blip r:embed="rId30">
+                    <a:blip r:embed="rId45">
                       <a:extLst>
                         <a:ext uri="{28A0092B-C50C-407E-A947-70E740481C1C}">
                           <a14:useLocalDpi xmlns:a14="http://schemas.microsoft.com/office/drawing/2010/main" val="0"/>
@@ -4839,10 +6349,24 @@
         <w:t xml:space="preserve"> PC </w:t>
       </w:r>
       <w:r>
-        <w:t>megkapta a kérelmezett IP</w:t>
-      </w:r>
-      <w:r>
-        <w:t>v4-es</w:t>
+        <w:t xml:space="preserve">megkapta a kérelmezett </w:t>
+      </w:r>
+      <w:r>
+        <w:rPr>
+          <w:i/>
+          <w:iCs/>
+        </w:rPr>
+        <w:t>IP</w:t>
+      </w:r>
+      <w:r>
+        <w:rPr>
+          <w:i/>
+          <w:iCs/>
+        </w:rPr>
+        <w:t>v4</w:t>
+      </w:r>
+      <w:r>
+        <w:t>-es</w:t>
       </w:r>
       <w:r>
         <w:t xml:space="preserve"> információkat a szervertől</w:t>
@@ -5351,7 +6875,7 @@
                     </pic:cNvPicPr>
                   </pic:nvPicPr>
                   <pic:blipFill rotWithShape="1">
-                    <a:blip r:embed="rId31">
+                    <a:blip r:embed="rId46">
                       <a:extLst>
                         <a:ext uri="{28A0092B-C50C-407E-A947-70E740481C1C}">
                           <a14:useLocalDpi xmlns:a14="http://schemas.microsoft.com/office/drawing/2010/main" val="0"/>
@@ -5417,7 +6941,7 @@
                     </pic:cNvPicPr>
                   </pic:nvPicPr>
                   <pic:blipFill rotWithShape="1">
-                    <a:blip r:embed="rId32">
+                    <a:blip r:embed="rId47">
                       <a:extLst>
                         <a:ext uri="{28A0092B-C50C-407E-A947-70E740481C1C}">
                           <a14:useLocalDpi xmlns:a14="http://schemas.microsoft.com/office/drawing/2010/main" val="0"/>
@@ -5489,7 +7013,7 @@
                     </pic:cNvPicPr>
                   </pic:nvPicPr>
                   <pic:blipFill rotWithShape="1">
-                    <a:blip r:embed="rId33">
+                    <a:blip r:embed="rId48">
                       <a:extLst>
                         <a:ext uri="{28A0092B-C50C-407E-A947-70E740481C1C}">
                           <a14:useLocalDpi xmlns:a14="http://schemas.microsoft.com/office/drawing/2010/main" val="0"/>
@@ -5623,19 +7147,6 @@
       <w:pPr>
         <w:jc w:val="both"/>
       </w:pPr>
-      <w:r>
-        <w:tab/>
-      </w:r>
-    </w:p>
-    <w:p>
-      <w:pPr>
-        <w:jc w:val="both"/>
-      </w:pPr>
-    </w:p>
-    <w:p>
-      <w:pPr>
-        <w:jc w:val="both"/>
-      </w:pPr>
     </w:p>
     <w:p>
       <w:r>
@@ -6036,7 +7547,7 @@
                     </pic:cNvPicPr>
                   </pic:nvPicPr>
                   <pic:blipFill rotWithShape="1">
-                    <a:blip r:embed="rId34">
+                    <a:blip r:embed="rId49">
                       <a:extLst>
                         <a:ext uri="{28A0092B-C50C-407E-A947-70E740481C1C}">
                           <a14:useLocalDpi xmlns:a14="http://schemas.microsoft.com/office/drawing/2010/main" val="0"/>
@@ -6108,7 +7619,7 @@
                     </pic:cNvPicPr>
                   </pic:nvPicPr>
                   <pic:blipFill rotWithShape="1">
-                    <a:blip r:embed="rId35">
+                    <a:blip r:embed="rId50">
                       <a:extLst>
                         <a:ext uri="{28A0092B-C50C-407E-A947-70E740481C1C}">
                           <a14:useLocalDpi xmlns:a14="http://schemas.microsoft.com/office/drawing/2010/main" val="0"/>
@@ -6237,7 +7748,7 @@
                     </pic:cNvPicPr>
                   </pic:nvPicPr>
                   <pic:blipFill rotWithShape="1">
-                    <a:blip r:embed="rId36">
+                    <a:blip r:embed="rId51">
                       <a:extLst>
                         <a:ext uri="{28A0092B-C50C-407E-A947-70E740481C1C}">
                           <a14:useLocalDpi xmlns:a14="http://schemas.microsoft.com/office/drawing/2010/main" val="0"/>
@@ -6303,7 +7814,7 @@
                     </pic:cNvPicPr>
                   </pic:nvPicPr>
                   <pic:blipFill rotWithShape="1">
-                    <a:blip r:embed="rId37">
+                    <a:blip r:embed="rId52">
                       <a:extLst>
                         <a:ext uri="{28A0092B-C50C-407E-A947-70E740481C1C}">
                           <a14:useLocalDpi xmlns:a14="http://schemas.microsoft.com/office/drawing/2010/main" val="0"/>
@@ -6499,6 +8010,39 @@
       <w:r>
         <w:tab/>
       </w:r>
+      <w:r>
+        <w:t xml:space="preserve">Az </w:t>
+      </w:r>
+      <w:r>
+        <w:rPr>
+          <w:b/>
+          <w:bCs/>
+        </w:rPr>
+        <w:t>IBM</w:t>
+      </w:r>
+      <w:r>
+        <w:t xml:space="preserve"> központban lévő szerverekhez való hozzáférést biztosító </w:t>
+      </w:r>
+      <w:r>
+        <w:rPr>
+          <w:b/>
+          <w:bCs/>
+        </w:rPr>
+        <w:t>címfordítását</w:t>
+      </w:r>
+      <w:r>
+        <w:t xml:space="preserve"> teszteljük le az </w:t>
+      </w:r>
+      <w:r>
+        <w:rPr>
+          <w:b/>
+          <w:bCs/>
+        </w:rPr>
+        <w:t>ANDOR</w:t>
+      </w:r>
+      <w:r>
+        <w:t xml:space="preserve"> telephelyről érkező csomagokkal.</w:t>
+      </w:r>
     </w:p>
     <w:p>
       <w:pPr>
@@ -6584,6 +8128,7 @@
           <w:iCs/>
           <w:u w:val="single"/>
         </w:rPr>
+        <w:lastRenderedPageBreak/>
         <w:t>Teszt menete:</w:t>
       </w:r>
     </w:p>
@@ -6592,21 +8137,75 @@
         <w:jc w:val="both"/>
       </w:pPr>
       <w:r>
-        <w:lastRenderedPageBreak/>
         <w:tab/>
         <w:t>A teszt során</w:t>
       </w:r>
-    </w:p>
-    <w:p>
-      <w:pPr>
-        <w:jc w:val="both"/>
-      </w:pPr>
-    </w:p>
-    <w:p>
-      <w:pPr>
-        <w:jc w:val="both"/>
-      </w:pPr>
-      <w:r>
+      <w:r>
+        <w:t xml:space="preserve"> az </w:t>
+      </w:r>
+      <w:r>
+        <w:rPr>
+          <w:b/>
+          <w:bCs/>
+        </w:rPr>
+        <w:t>ANDOR</w:t>
+      </w:r>
+      <w:r>
+        <w:t xml:space="preserve"> telephely</w:t>
+      </w:r>
+      <w:r>
+        <w:t xml:space="preserve">ről érkező csomagok az </w:t>
+      </w:r>
+      <w:r>
+        <w:rPr>
+          <w:b/>
+          <w:bCs/>
+        </w:rPr>
+        <w:t>IBM_CNTRL_RTR0</w:t>
+      </w:r>
+      <w:r>
+        <w:t xml:space="preserve"> routernél továbbítva lesznek a  megfelelő szerverhez a csomagok által célzott portok alapján, majd a visszafelé induló válasz is hasonló módon megy ki a központból</w:t>
+      </w:r>
+      <w:r>
+        <w:t xml:space="preserve"> és ezek a </w:t>
+      </w:r>
+      <w:r>
+        <w:rPr>
+          <w:i/>
+          <w:iCs/>
+        </w:rPr>
+        <w:t>címfordítások</w:t>
+      </w:r>
+      <w:r>
+        <w:t xml:space="preserve"> látszanak egy </w:t>
+      </w:r>
+      <w:r>
+        <w:t>táblázatban,</w:t>
+      </w:r>
+      <w:r>
+        <w:t xml:space="preserve"> amit meg is fogunk tekinteni.</w:t>
+      </w:r>
+    </w:p>
+    <w:p>
+      <w:pPr>
+        <w:jc w:val="both"/>
+      </w:pPr>
+    </w:p>
+    <w:p>
+      <w:pPr>
+        <w:jc w:val="both"/>
+        <w:rPr>
+          <w:i/>
+          <w:iCs/>
+          <w:u w:val="single"/>
+        </w:rPr>
+      </w:pPr>
+      <w:r>
+        <w:rPr>
+          <w:i/>
+          <w:iCs/>
+          <w:u w:val="single"/>
+        </w:rPr>
         <w:t>Teszt várt eredménye:</w:t>
       </w:r>
     </w:p>
@@ -6617,23 +8216,192 @@
       <w:r>
         <w:tab/>
       </w:r>
-    </w:p>
-    <w:p>
-      <w:pPr>
-        <w:jc w:val="both"/>
-      </w:pPr>
-    </w:p>
-    <w:p>
-      <w:pPr>
-        <w:jc w:val="both"/>
-      </w:pPr>
-    </w:p>
-    <w:p>
-      <w:pPr>
-        <w:jc w:val="both"/>
-      </w:pPr>
-      <w:r>
-        <w:t>A teszt eredménye – SIKERES/SIKERTEKLEN</w:t>
+      <w:r>
+        <w:t xml:space="preserve">A NAT fordítási táblában meg fog jelenni pár </w:t>
+      </w:r>
+      <w:r>
+        <w:t>csomag,</w:t>
+      </w:r>
+      <w:r>
+        <w:t xml:space="preserve"> ami be -és ki lett  fordítva a </w:t>
+      </w:r>
+      <w:r>
+        <w:rPr>
+          <w:b/>
+          <w:bCs/>
+        </w:rPr>
+        <w:t>NAT</w:t>
+      </w:r>
+      <w:r>
+        <w:t xml:space="preserve"> által.</w:t>
+      </w:r>
+    </w:p>
+    <w:p>
+      <w:pPr>
+        <w:jc w:val="both"/>
+      </w:pPr>
+      <w:r>
+        <w:rPr>
+          <w:noProof/>
+        </w:rPr>
+        <w:drawing>
+          <wp:anchor distT="0" distB="0" distL="114300" distR="114300" simplePos="0" relativeHeight="251694080" behindDoc="0" locked="0" layoutInCell="1" allowOverlap="1" wp14:anchorId="13D8E7C5" wp14:editId="0D0EC6D7">
+            <wp:simplePos x="0" y="0"/>
+            <wp:positionH relativeFrom="margin">
+              <wp:align>center</wp:align>
+            </wp:positionH>
+            <wp:positionV relativeFrom="paragraph">
+              <wp:posOffset>460823</wp:posOffset>
+            </wp:positionV>
+            <wp:extent cx="4064000" cy="4163060"/>
+            <wp:effectExtent l="0" t="0" r="0" b="8890"/>
+            <wp:wrapTopAndBottom/>
+            <wp:docPr id="821917532" name="Kép 44"/>
+            <wp:cNvGraphicFramePr>
+              <a:graphicFrameLocks xmlns:a="http://schemas.openxmlformats.org/drawingml/2006/main" noChangeAspect="1"/>
+            </wp:cNvGraphicFramePr>
+            <a:graphic xmlns:a="http://schemas.openxmlformats.org/drawingml/2006/main">
+              <a:graphicData uri="http://schemas.openxmlformats.org/drawingml/2006/picture">
+                <pic:pic xmlns:pic="http://schemas.openxmlformats.org/drawingml/2006/picture">
+                  <pic:nvPicPr>
+                    <pic:cNvPr id="0" name="Picture 231"/>
+                    <pic:cNvPicPr>
+                      <a:picLocks noChangeAspect="1" noChangeArrowheads="1"/>
+                    </pic:cNvPicPr>
+                  </pic:nvPicPr>
+                  <pic:blipFill>
+                    <a:blip r:embed="rId53">
+                      <a:extLst>
+                        <a:ext uri="{28A0092B-C50C-407E-A947-70E740481C1C}">
+                          <a14:useLocalDpi xmlns:a14="http://schemas.microsoft.com/office/drawing/2010/main" val="0"/>
+                        </a:ext>
+                      </a:extLst>
+                    </a:blip>
+                    <a:srcRect/>
+                    <a:stretch>
+                      <a:fillRect/>
+                    </a:stretch>
+                  </pic:blipFill>
+                  <pic:spPr bwMode="auto">
+                    <a:xfrm>
+                      <a:off x="0" y="0"/>
+                      <a:ext cx="4064000" cy="4163060"/>
+                    </a:xfrm>
+                    <a:prstGeom prst="rect">
+                      <a:avLst/>
+                    </a:prstGeom>
+                    <a:noFill/>
+                    <a:ln>
+                      <a:noFill/>
+                    </a:ln>
+                  </pic:spPr>
+                </pic:pic>
+              </a:graphicData>
+            </a:graphic>
+            <wp14:sizeRelH relativeFrom="margin">
+              <wp14:pctWidth>0</wp14:pctWidth>
+            </wp14:sizeRelH>
+            <wp14:sizeRelV relativeFrom="margin">
+              <wp14:pctHeight>0</wp14:pctHeight>
+            </wp14:sizeRelV>
+          </wp:anchor>
+        </w:drawing>
+      </w:r>
+    </w:p>
+    <w:p>
+      <w:pPr>
+        <w:jc w:val="both"/>
+      </w:pPr>
+    </w:p>
+    <w:p>
+      <w:pPr>
+        <w:jc w:val="both"/>
+      </w:pPr>
+      <w:r>
+        <w:rPr>
+          <w:noProof/>
+        </w:rPr>
+        <w:lastRenderedPageBreak/>
+        <w:drawing>
+          <wp:anchor distT="0" distB="0" distL="114300" distR="114300" simplePos="0" relativeHeight="251695104" behindDoc="0" locked="0" layoutInCell="1" allowOverlap="1" wp14:anchorId="705FAF9D" wp14:editId="3EBB9945">
+            <wp:simplePos x="0" y="0"/>
+            <wp:positionH relativeFrom="margin">
+              <wp:align>center</wp:align>
+            </wp:positionH>
+            <wp:positionV relativeFrom="paragraph">
+              <wp:posOffset>129577</wp:posOffset>
+            </wp:positionV>
+            <wp:extent cx="3926205" cy="4057650"/>
+            <wp:effectExtent l="0" t="0" r="0" b="0"/>
+            <wp:wrapTopAndBottom/>
+            <wp:docPr id="154447719" name="Kép 45"/>
+            <wp:cNvGraphicFramePr>
+              <a:graphicFrameLocks xmlns:a="http://schemas.openxmlformats.org/drawingml/2006/main" noChangeAspect="1"/>
+            </wp:cNvGraphicFramePr>
+            <a:graphic xmlns:a="http://schemas.openxmlformats.org/drawingml/2006/main">
+              <a:graphicData uri="http://schemas.openxmlformats.org/drawingml/2006/picture">
+                <pic:pic xmlns:pic="http://schemas.openxmlformats.org/drawingml/2006/picture">
+                  <pic:nvPicPr>
+                    <pic:cNvPr id="0" name="Picture 232"/>
+                    <pic:cNvPicPr>
+                      <a:picLocks noChangeAspect="1" noChangeArrowheads="1"/>
+                    </pic:cNvPicPr>
+                  </pic:nvPicPr>
+                  <pic:blipFill>
+                    <a:blip r:embed="rId54">
+                      <a:extLst>
+                        <a:ext uri="{28A0092B-C50C-407E-A947-70E740481C1C}">
+                          <a14:useLocalDpi xmlns:a14="http://schemas.microsoft.com/office/drawing/2010/main" val="0"/>
+                        </a:ext>
+                      </a:extLst>
+                    </a:blip>
+                    <a:srcRect/>
+                    <a:stretch>
+                      <a:fillRect/>
+                    </a:stretch>
+                  </pic:blipFill>
+                  <pic:spPr bwMode="auto">
+                    <a:xfrm>
+                      <a:off x="0" y="0"/>
+                      <a:ext cx="3926205" cy="4057650"/>
+                    </a:xfrm>
+                    <a:prstGeom prst="rect">
+                      <a:avLst/>
+                    </a:prstGeom>
+                    <a:noFill/>
+                    <a:ln>
+                      <a:noFill/>
+                    </a:ln>
+                  </pic:spPr>
+                </pic:pic>
+              </a:graphicData>
+            </a:graphic>
+            <wp14:sizeRelH relativeFrom="margin">
+              <wp14:pctWidth>0</wp14:pctWidth>
+            </wp14:sizeRelH>
+            <wp14:sizeRelV relativeFrom="margin">
+              <wp14:pctHeight>0</wp14:pctHeight>
+            </wp14:sizeRelV>
+          </wp:anchor>
+        </w:drawing>
+      </w:r>
+    </w:p>
+    <w:p>
+      <w:pPr>
+        <w:jc w:val="both"/>
+        <w:rPr>
+          <w:i/>
+          <w:iCs/>
+          <w:u w:val="single"/>
+        </w:rPr>
+      </w:pPr>
+      <w:r>
+        <w:rPr>
+          <w:i/>
+          <w:iCs/>
+          <w:u w:val="single"/>
+        </w:rPr>
+        <w:t>A teszt eredménye – SIKERES</w:t>
       </w:r>
     </w:p>
     <w:p>
@@ -6643,16 +8411,61 @@
       <w:r>
         <w:tab/>
       </w:r>
-    </w:p>
-    <w:p>
-      <w:pPr>
-        <w:jc w:val="both"/>
-      </w:pPr>
-    </w:p>
-    <w:p>
-      <w:pPr>
-        <w:ind w:firstLine="708"/>
-      </w:pPr>
+      <w:r>
+        <w:t xml:space="preserve">A táblázatban tisztán látható a </w:t>
+      </w:r>
+      <w:r>
+        <w:rPr>
+          <w:i/>
+          <w:iCs/>
+        </w:rPr>
+        <w:t>publikus</w:t>
+      </w:r>
+      <w:r>
+        <w:t xml:space="preserve"> </w:t>
+      </w:r>
+      <w:r>
+        <w:rPr>
+          <w:i/>
+          <w:iCs/>
+        </w:rPr>
+        <w:t>és</w:t>
+      </w:r>
+      <w:r>
+        <w:t xml:space="preserve"> </w:t>
+      </w:r>
+      <w:r>
+        <w:rPr>
+          <w:i/>
+          <w:iCs/>
+        </w:rPr>
+        <w:t>privát</w:t>
+      </w:r>
+      <w:r>
+        <w:t xml:space="preserve"> </w:t>
+      </w:r>
+      <w:r>
+        <w:rPr>
+          <w:i/>
+          <w:iCs/>
+        </w:rPr>
+        <w:t>belső</w:t>
+      </w:r>
+      <w:r>
+        <w:t xml:space="preserve"> </w:t>
+      </w:r>
+      <w:r>
+        <w:rPr>
+          <w:i/>
+          <w:iCs/>
+        </w:rPr>
+        <w:t>címek</w:t>
+      </w:r>
+      <w:r>
+        <w:t xml:space="preserve"> fordítása portok alapján.</w:t>
+      </w:r>
+    </w:p>
+    <w:p>
       <w:r>
         <w:br/>
       </w:r>
@@ -6721,16 +8534,121 @@
         <w:jc w:val="both"/>
       </w:pPr>
       <w:r>
+        <w:rPr>
+          <w:noProof/>
+        </w:rPr>
+        <w:drawing>
+          <wp:anchor distT="0" distB="0" distL="114300" distR="114300" simplePos="0" relativeHeight="251688960" behindDoc="0" locked="0" layoutInCell="1" allowOverlap="1" wp14:anchorId="0467763B" wp14:editId="695005C2">
+            <wp:simplePos x="0" y="0"/>
+            <wp:positionH relativeFrom="margin">
+              <wp:align>right</wp:align>
+            </wp:positionH>
+            <wp:positionV relativeFrom="paragraph">
+              <wp:posOffset>558987</wp:posOffset>
+            </wp:positionV>
+            <wp:extent cx="5755640" cy="1968500"/>
+            <wp:effectExtent l="0" t="0" r="0" b="0"/>
+            <wp:wrapTopAndBottom/>
+            <wp:docPr id="1132707659" name="Kép 33"/>
+            <wp:cNvGraphicFramePr>
+              <a:graphicFrameLocks xmlns:a="http://schemas.openxmlformats.org/drawingml/2006/main" noChangeAspect="1"/>
+            </wp:cNvGraphicFramePr>
+            <a:graphic xmlns:a="http://schemas.openxmlformats.org/drawingml/2006/main">
+              <a:graphicData uri="http://schemas.openxmlformats.org/drawingml/2006/picture">
+                <pic:pic xmlns:pic="http://schemas.openxmlformats.org/drawingml/2006/picture">
+                  <pic:nvPicPr>
+                    <pic:cNvPr id="0" name="Picture 195"/>
+                    <pic:cNvPicPr>
+                      <a:picLocks noChangeAspect="1" noChangeArrowheads="1"/>
+                    </pic:cNvPicPr>
+                  </pic:nvPicPr>
+                  <pic:blipFill>
+                    <a:blip r:embed="rId55" cstate="print">
+                      <a:extLst>
+                        <a:ext uri="{28A0092B-C50C-407E-A947-70E740481C1C}">
+                          <a14:useLocalDpi xmlns:a14="http://schemas.microsoft.com/office/drawing/2010/main" val="0"/>
+                        </a:ext>
+                      </a:extLst>
+                    </a:blip>
+                    <a:srcRect/>
+                    <a:stretch>
+                      <a:fillRect/>
+                    </a:stretch>
+                  </pic:blipFill>
+                  <pic:spPr bwMode="auto">
+                    <a:xfrm>
+                      <a:off x="0" y="0"/>
+                      <a:ext cx="5755640" cy="1968500"/>
+                    </a:xfrm>
+                    <a:prstGeom prst="rect">
+                      <a:avLst/>
+                    </a:prstGeom>
+                    <a:noFill/>
+                    <a:ln>
+                      <a:noFill/>
+                    </a:ln>
+                  </pic:spPr>
+                </pic:pic>
+              </a:graphicData>
+            </a:graphic>
+          </wp:anchor>
+        </w:drawing>
+      </w:r>
+      <w:r>
         <w:tab/>
       </w:r>
       <w:r>
-        <w:t xml:space="preserve">A Kunigunda útjai telephelyen megvalósított </w:t>
-      </w:r>
-      <w:r>
-        <w:t>STP</w:t>
-      </w:r>
-      <w:r>
-        <w:t xml:space="preserve"> tesztelésén át fogjuk szemléltetni a helyes működést.</w:t>
+        <w:t xml:space="preserve">A </w:t>
+      </w:r>
+      <w:r>
+        <w:rPr>
+          <w:b/>
+          <w:bCs/>
+        </w:rPr>
+        <w:t>Kunigunda</w:t>
+      </w:r>
+      <w:r>
+        <w:t xml:space="preserve"> </w:t>
+      </w:r>
+      <w:r>
+        <w:rPr>
+          <w:b/>
+          <w:bCs/>
+        </w:rPr>
+        <w:t>útjai</w:t>
+      </w:r>
+      <w:r>
+        <w:t xml:space="preserve"> és az </w:t>
+      </w:r>
+      <w:r>
+        <w:rPr>
+          <w:b/>
+          <w:bCs/>
+        </w:rPr>
+        <w:t>IBM</w:t>
+      </w:r>
+      <w:r>
+        <w:t xml:space="preserve"> </w:t>
+      </w:r>
+      <w:r>
+        <w:rPr>
+          <w:b/>
+          <w:bCs/>
+        </w:rPr>
+        <w:t>központ</w:t>
+      </w:r>
+      <w:r>
+        <w:t xml:space="preserve"> közötti </w:t>
+      </w:r>
+      <w:r>
+        <w:rPr>
+          <w:b/>
+          <w:bCs/>
+        </w:rPr>
+        <w:t>VPN</w:t>
+      </w:r>
+      <w:r>
+        <w:t xml:space="preserve"> tunnel titkosítását teszteljük le egy minimalizált topológián.</w:t>
       </w:r>
     </w:p>
     <w:p>
@@ -6770,244 +8688,13 @@
           <w:noProof/>
         </w:rPr>
       </w:pPr>
-    </w:p>
-    <w:p>
-      <w:pPr>
-        <w:jc w:val="both"/>
-        <w:rPr>
-          <w:i/>
-          <w:iCs/>
-          <w:u w:val="single"/>
-        </w:rPr>
-      </w:pPr>
-      <w:r>
-        <w:rPr>
-          <w:i/>
-          <w:iCs/>
-          <w:u w:val="single"/>
-        </w:rPr>
-        <w:t>Teszt menete:</w:t>
-      </w:r>
-    </w:p>
-    <w:p>
-      <w:pPr>
-        <w:jc w:val="both"/>
-      </w:pPr>
-      <w:r>
-        <w:tab/>
-        <w:t>A teszt során</w:t>
-      </w:r>
-    </w:p>
-    <w:p>
-      <w:pPr>
-        <w:jc w:val="both"/>
-      </w:pPr>
-    </w:p>
-    <w:p>
-      <w:pPr>
-        <w:jc w:val="both"/>
-      </w:pPr>
-      <w:r>
-        <w:t>Teszt várt eredménye:</w:t>
-      </w:r>
-    </w:p>
-    <w:p>
-      <w:pPr>
-        <w:jc w:val="both"/>
-      </w:pPr>
-      <w:r>
-        <w:tab/>
-      </w:r>
-    </w:p>
-    <w:p>
-      <w:pPr>
-        <w:jc w:val="both"/>
-      </w:pPr>
-    </w:p>
-    <w:p>
-      <w:pPr>
-        <w:jc w:val="both"/>
-      </w:pPr>
-    </w:p>
-    <w:p>
-      <w:pPr>
-        <w:jc w:val="both"/>
-      </w:pPr>
-      <w:r>
-        <w:t>A teszt eredménye – SIKERES/SIKERTEKLEN</w:t>
-      </w:r>
-    </w:p>
-    <w:p>
-      <w:pPr>
-        <w:jc w:val="both"/>
-      </w:pPr>
-      <w:r>
-        <w:tab/>
-      </w:r>
-    </w:p>
-    <w:p>
-      <w:pPr>
-        <w:jc w:val="both"/>
-      </w:pPr>
-    </w:p>
-    <w:p>
-      <w:pPr>
-        <w:ind w:firstLine="708"/>
-      </w:pPr>
-      <w:r>
-        <w:lastRenderedPageBreak/>
-        <w:br/>
-      </w:r>
-      <w:r>
-        <w:pict w14:anchorId="74DD5ECE">
-          <v:rect id="_x0000_i1188" style="width:470.3pt;height:1.2pt" o:hralign="center" o:hrstd="t" o:hr="t" fillcolor="#a0a0a0" stroked="f"/>
-        </w:pict>
-      </w:r>
-    </w:p>
-    <w:p>
-      <w:pPr>
-        <w:pStyle w:val="Cmsor1"/>
-        <w:rPr>
-          <w:rStyle w:val="CmChar"/>
-          <w:rFonts w:ascii="Bell MT" w:hAnsi="Bell MT"/>
-          <w:b/>
-          <w:bCs/>
-          <w:color w:val="EDED0D"/>
-          <w:sz w:val="44"/>
-          <w:szCs w:val="44"/>
-          <w:u w:val="single"/>
-        </w:rPr>
-      </w:pPr>
-      <w:r>
-        <w:rPr>
-          <w:rStyle w:val="CmChar"/>
-          <w:rFonts w:ascii="Bell MT" w:hAnsi="Bell MT"/>
-          <w:b/>
-          <w:bCs/>
-          <w:color w:val="77206D" w:themeColor="accent5" w:themeShade="BF"/>
-          <w:sz w:val="44"/>
-          <w:szCs w:val="44"/>
-          <w:u w:val="single"/>
-        </w:rPr>
-        <w:t>V</w:t>
-      </w:r>
-      <w:r>
-        <w:rPr>
-          <w:rStyle w:val="CmChar"/>
-          <w:rFonts w:ascii="Bell MT" w:hAnsi="Bell MT"/>
-          <w:b/>
-          <w:bCs/>
-          <w:color w:val="77206D" w:themeColor="accent5" w:themeShade="BF"/>
-          <w:sz w:val="44"/>
-          <w:szCs w:val="44"/>
-          <w:u w:val="single"/>
-        </w:rPr>
-        <w:t>fff</w:t>
-      </w:r>
-      <w:r>
-        <w:rPr>
-          <w:rStyle w:val="CmChar"/>
-          <w:rFonts w:ascii="Bell MT" w:hAnsi="Bell MT"/>
-          <w:b/>
-          <w:bCs/>
-          <w:color w:val="77206D" w:themeColor="accent5" w:themeShade="BF"/>
-          <w:sz w:val="44"/>
-          <w:szCs w:val="44"/>
-          <w:u w:val="single"/>
-        </w:rPr>
-        <w:t>P</w:t>
-      </w:r>
-      <w:r>
-        <w:rPr>
-          <w:rStyle w:val="CmChar"/>
-          <w:rFonts w:ascii="Bell MT" w:hAnsi="Bell MT"/>
-          <w:b/>
-          <w:bCs/>
-          <w:color w:val="77206D" w:themeColor="accent5" w:themeShade="BF"/>
-          <w:sz w:val="44"/>
-          <w:szCs w:val="44"/>
-          <w:u w:val="single"/>
-        </w:rPr>
-        <w:t>f</w:t>
-      </w:r>
-      <w:r>
-        <w:rPr>
-          <w:rStyle w:val="CmChar"/>
-          <w:rFonts w:ascii="Bell MT" w:hAnsi="Bell MT"/>
-          <w:b/>
-          <w:bCs/>
-          <w:color w:val="EDED0D"/>
-          <w:sz w:val="44"/>
-          <w:szCs w:val="44"/>
-          <w:u w:val="single"/>
-        </w:rPr>
-        <w:t>N</w:t>
-      </w:r>
-      <w:r>
-        <w:rPr>
-          <w:rStyle w:val="CmChar"/>
-          <w:rFonts w:ascii="Bell MT" w:hAnsi="Bell MT"/>
-          <w:b/>
-          <w:bCs/>
-          <w:color w:val="EDED0D"/>
-          <w:sz w:val="44"/>
-          <w:szCs w:val="44"/>
-          <w:u w:val="single"/>
-        </w:rPr>
-        <w:t>ffff</w:t>
-      </w:r>
-      <w:r>
-        <w:rPr>
-          <w:rStyle w:val="CmChar"/>
-          <w:rFonts w:ascii="Bell MT" w:hAnsi="Bell MT"/>
-          <w:b/>
-          <w:bCs/>
-          <w:color w:val="EDED0D"/>
-          <w:sz w:val="44"/>
-          <w:szCs w:val="44"/>
-          <w:u w:val="single"/>
-        </w:rPr>
-        <w:t>:</w:t>
-      </w:r>
-    </w:p>
-    <w:p>
-      <w:pPr>
-        <w:jc w:val="both"/>
-      </w:pPr>
-      <w:r>
-        <w:tab/>
-      </w:r>
-      <w:r>
-        <w:t xml:space="preserve">A Kunigunda útjai telephelyen megvalósított </w:t>
-      </w:r>
-      <w:r>
-        <w:t>STP</w:t>
-      </w:r>
-      <w:r>
-        <w:t xml:space="preserve"> tesztelésén át fogjuk szemléltetni a helyes működést.</w:t>
-      </w:r>
-    </w:p>
-    <w:p>
-      <w:pPr>
-        <w:jc w:val="both"/>
-      </w:pPr>
-    </w:p>
-    <w:p>
-      <w:pPr>
-        <w:jc w:val="both"/>
-        <w:rPr>
-          <w:i/>
-          <w:iCs/>
-          <w:u w:val="single"/>
-        </w:rPr>
-      </w:pPr>
-      <w:r>
-        <w:rPr>
-          <w:i/>
-          <w:iCs/>
-          <w:u w:val="single"/>
-        </w:rPr>
-        <w:t>Vizsgált eszközök:</w:t>
+      <w:r>
+        <w:rPr>
+          <w:b/>
+          <w:bCs/>
+          <w:noProof/>
+        </w:rPr>
+        <w:t>R_KUN</w:t>
       </w:r>
     </w:p>
     <w:p>
@@ -7024,6 +8711,14 @@
           <w:noProof/>
         </w:rPr>
       </w:pPr>
+      <w:r>
+        <w:rPr>
+          <w:b/>
+          <w:bCs/>
+          <w:noProof/>
+        </w:rPr>
+        <w:t>IBM_CNTRL_RTR1</w:t>
+      </w:r>
     </w:p>
     <w:p>
       <w:pPr>
@@ -7051,17 +8746,50 @@
         <w:tab/>
         <w:t>A teszt során</w:t>
       </w:r>
-    </w:p>
-    <w:p>
-      <w:pPr>
-        <w:jc w:val="both"/>
-      </w:pPr>
-    </w:p>
-    <w:p>
-      <w:pPr>
-        <w:jc w:val="both"/>
-      </w:pPr>
-      <w:r>
+      <w:r>
+        <w:t xml:space="preserve"> egy csomag </w:t>
+      </w:r>
+      <w:r>
+        <w:rPr>
+          <w:i/>
+          <w:iCs/>
+        </w:rPr>
+        <w:t>PDU</w:t>
+      </w:r>
+      <w:r>
+        <w:t xml:space="preserve">-ját fogjuk megnézni, hogy ténylegesen titkosított-e a </w:t>
+      </w:r>
+      <w:r>
+        <w:rPr>
+          <w:i/>
+          <w:iCs/>
+        </w:rPr>
+        <w:t>tunnel</w:t>
+      </w:r>
+      <w:r>
+        <w:t>-en áthaladó adatforgalom.</w:t>
+      </w:r>
+    </w:p>
+    <w:p>
+      <w:pPr>
+        <w:jc w:val="both"/>
+      </w:pPr>
+    </w:p>
+    <w:p>
+      <w:pPr>
+        <w:jc w:val="both"/>
+        <w:rPr>
+          <w:i/>
+          <w:iCs/>
+          <w:u w:val="single"/>
+        </w:rPr>
+      </w:pPr>
+      <w:r>
+        <w:rPr>
+          <w:i/>
+          <w:iCs/>
+          <w:u w:val="single"/>
+        </w:rPr>
         <w:t>Teszt várt eredménye:</w:t>
       </w:r>
     </w:p>
@@ -7070,25 +8798,362 @@
         <w:jc w:val="both"/>
       </w:pPr>
       <w:r>
+        <w:drawing>
+          <wp:anchor distT="0" distB="0" distL="114300" distR="114300" simplePos="0" relativeHeight="251691008" behindDoc="0" locked="0" layoutInCell="1" allowOverlap="1" wp14:anchorId="4C950D91" wp14:editId="46351132">
+            <wp:simplePos x="0" y="0"/>
+            <wp:positionH relativeFrom="margin">
+              <wp:align>center</wp:align>
+            </wp:positionH>
+            <wp:positionV relativeFrom="paragraph">
+              <wp:posOffset>3957470</wp:posOffset>
+            </wp:positionV>
+            <wp:extent cx="3329305" cy="3420745"/>
+            <wp:effectExtent l="0" t="0" r="4445" b="8255"/>
+            <wp:wrapTopAndBottom/>
+            <wp:docPr id="1093632411" name="Kép 37"/>
+            <wp:cNvGraphicFramePr>
+              <a:graphicFrameLocks xmlns:a="http://schemas.openxmlformats.org/drawingml/2006/main" noChangeAspect="1"/>
+            </wp:cNvGraphicFramePr>
+            <a:graphic xmlns:a="http://schemas.openxmlformats.org/drawingml/2006/main">
+              <a:graphicData uri="http://schemas.openxmlformats.org/drawingml/2006/picture">
+                <pic:pic xmlns:pic="http://schemas.openxmlformats.org/drawingml/2006/picture">
+                  <pic:nvPicPr>
+                    <pic:cNvPr id="0" name="Picture 208"/>
+                    <pic:cNvPicPr>
+                      <a:picLocks noChangeAspect="1" noChangeArrowheads="1"/>
+                    </pic:cNvPicPr>
+                  </pic:nvPicPr>
+                  <pic:blipFill>
+                    <a:blip r:embed="rId56">
+                      <a:extLst>
+                        <a:ext uri="{28A0092B-C50C-407E-A947-70E740481C1C}">
+                          <a14:useLocalDpi xmlns:a14="http://schemas.microsoft.com/office/drawing/2010/main" val="0"/>
+                        </a:ext>
+                      </a:extLst>
+                    </a:blip>
+                    <a:srcRect/>
+                    <a:stretch>
+                      <a:fillRect/>
+                    </a:stretch>
+                  </pic:blipFill>
+                  <pic:spPr bwMode="auto">
+                    <a:xfrm>
+                      <a:off x="0" y="0"/>
+                      <a:ext cx="3329305" cy="3420745"/>
+                    </a:xfrm>
+                    <a:prstGeom prst="rect">
+                      <a:avLst/>
+                    </a:prstGeom>
+                    <a:noFill/>
+                    <a:ln>
+                      <a:noFill/>
+                    </a:ln>
+                  </pic:spPr>
+                </pic:pic>
+              </a:graphicData>
+            </a:graphic>
+            <wp14:sizeRelH relativeFrom="margin">
+              <wp14:pctWidth>0</wp14:pctWidth>
+            </wp14:sizeRelH>
+            <wp14:sizeRelV relativeFrom="margin">
+              <wp14:pctHeight>0</wp14:pctHeight>
+            </wp14:sizeRelV>
+          </wp:anchor>
+        </w:drawing>
+      </w:r>
+      <w:r>
+        <w:drawing>
+          <wp:anchor distT="0" distB="0" distL="114300" distR="114300" simplePos="0" relativeHeight="251689984" behindDoc="0" locked="0" layoutInCell="1" allowOverlap="1" wp14:anchorId="3F6DACF9" wp14:editId="18AF8540">
+            <wp:simplePos x="0" y="0"/>
+            <wp:positionH relativeFrom="margin">
+              <wp:align>center</wp:align>
+            </wp:positionH>
+            <wp:positionV relativeFrom="paragraph">
+              <wp:posOffset>493544</wp:posOffset>
+            </wp:positionV>
+            <wp:extent cx="3271638" cy="3356386"/>
+            <wp:effectExtent l="0" t="0" r="5080" b="0"/>
+            <wp:wrapTopAndBottom/>
+            <wp:docPr id="70198387" name="Kép 35"/>
+            <wp:cNvGraphicFramePr>
+              <a:graphicFrameLocks xmlns:a="http://schemas.openxmlformats.org/drawingml/2006/main" noChangeAspect="1"/>
+            </wp:cNvGraphicFramePr>
+            <a:graphic xmlns:a="http://schemas.openxmlformats.org/drawingml/2006/main">
+              <a:graphicData uri="http://schemas.openxmlformats.org/drawingml/2006/picture">
+                <pic:pic xmlns:pic="http://schemas.openxmlformats.org/drawingml/2006/picture">
+                  <pic:nvPicPr>
+                    <pic:cNvPr id="0" name="Picture 201"/>
+                    <pic:cNvPicPr>
+                      <a:picLocks noChangeAspect="1" noChangeArrowheads="1"/>
+                    </pic:cNvPicPr>
+                  </pic:nvPicPr>
+                  <pic:blipFill>
+                    <a:blip r:embed="rId57">
+                      <a:extLst>
+                        <a:ext uri="{28A0092B-C50C-407E-A947-70E740481C1C}">
+                          <a14:useLocalDpi xmlns:a14="http://schemas.microsoft.com/office/drawing/2010/main" val="0"/>
+                        </a:ext>
+                      </a:extLst>
+                    </a:blip>
+                    <a:srcRect/>
+                    <a:stretch>
+                      <a:fillRect/>
+                    </a:stretch>
+                  </pic:blipFill>
+                  <pic:spPr bwMode="auto">
+                    <a:xfrm>
+                      <a:off x="0" y="0"/>
+                      <a:ext cx="3271638" cy="3356386"/>
+                    </a:xfrm>
+                    <a:prstGeom prst="rect">
+                      <a:avLst/>
+                    </a:prstGeom>
+                    <a:noFill/>
+                    <a:ln>
+                      <a:noFill/>
+                    </a:ln>
+                  </pic:spPr>
+                </pic:pic>
+              </a:graphicData>
+            </a:graphic>
+          </wp:anchor>
+        </w:drawing>
+      </w:r>
+      <w:r>
         <w:tab/>
       </w:r>
-    </w:p>
-    <w:p>
-      <w:pPr>
-        <w:jc w:val="both"/>
-      </w:pPr>
-    </w:p>
-    <w:p>
-      <w:pPr>
-        <w:jc w:val="both"/>
-      </w:pPr>
-    </w:p>
-    <w:p>
-      <w:pPr>
-        <w:jc w:val="both"/>
-      </w:pPr>
-      <w:r>
-        <w:t>A teszt eredménye – SIKERES/SIKERTEKLEN</w:t>
+      <w:r>
+        <w:t xml:space="preserve">A </w:t>
+      </w:r>
+      <w:r>
+        <w:rPr>
+          <w:i/>
+          <w:iCs/>
+        </w:rPr>
+        <w:t>PDU</w:t>
+      </w:r>
+      <w:r>
+        <w:t xml:space="preserve"> mutatni fog egy </w:t>
+      </w:r>
+      <w:r>
+        <w:rPr>
+          <w:i/>
+          <w:iCs/>
+        </w:rPr>
+        <w:t>ESP Header</w:t>
+      </w:r>
+      <w:r>
+        <w:t>-t, ami titkosítva van, így nem tudjuk azt, hogy mi  a csomag tartalma.</w:t>
+      </w:r>
+    </w:p>
+    <w:p>
+      <w:pPr>
+        <w:jc w:val="both"/>
+      </w:pPr>
+    </w:p>
+    <w:p>
+      <w:pPr>
+        <w:jc w:val="both"/>
+      </w:pPr>
+      <w:r>
+        <w:drawing>
+          <wp:anchor distT="0" distB="0" distL="114300" distR="114300" simplePos="0" relativeHeight="251693056" behindDoc="0" locked="0" layoutInCell="1" allowOverlap="1" wp14:anchorId="7339467D" wp14:editId="4E634051">
+            <wp:simplePos x="0" y="0"/>
+            <wp:positionH relativeFrom="column">
+              <wp:posOffset>3061970</wp:posOffset>
+            </wp:positionH>
+            <wp:positionV relativeFrom="paragraph">
+              <wp:posOffset>3810</wp:posOffset>
+            </wp:positionV>
+            <wp:extent cx="2707005" cy="3442335"/>
+            <wp:effectExtent l="0" t="0" r="0" b="5715"/>
+            <wp:wrapSquare wrapText="bothSides"/>
+            <wp:docPr id="1041622829" name="Kép 41"/>
+            <wp:cNvGraphicFramePr>
+              <a:graphicFrameLocks xmlns:a="http://schemas.openxmlformats.org/drawingml/2006/main" noChangeAspect="1"/>
+            </wp:cNvGraphicFramePr>
+            <a:graphic xmlns:a="http://schemas.openxmlformats.org/drawingml/2006/main">
+              <a:graphicData uri="http://schemas.openxmlformats.org/drawingml/2006/picture">
+                <pic:pic xmlns:pic="http://schemas.openxmlformats.org/drawingml/2006/picture">
+                  <pic:nvPicPr>
+                    <pic:cNvPr id="0" name="Picture 222"/>
+                    <pic:cNvPicPr>
+                      <a:picLocks noChangeAspect="1" noChangeArrowheads="1"/>
+                    </pic:cNvPicPr>
+                  </pic:nvPicPr>
+                  <pic:blipFill>
+                    <a:blip r:embed="rId58">
+                      <a:extLst>
+                        <a:ext uri="{28A0092B-C50C-407E-A947-70E740481C1C}">
+                          <a14:useLocalDpi xmlns:a14="http://schemas.microsoft.com/office/drawing/2010/main" val="0"/>
+                        </a:ext>
+                      </a:extLst>
+                    </a:blip>
+                    <a:srcRect/>
+                    <a:stretch>
+                      <a:fillRect/>
+                    </a:stretch>
+                  </pic:blipFill>
+                  <pic:spPr bwMode="auto">
+                    <a:xfrm>
+                      <a:off x="0" y="0"/>
+                      <a:ext cx="2707005" cy="3442335"/>
+                    </a:xfrm>
+                    <a:prstGeom prst="rect">
+                      <a:avLst/>
+                    </a:prstGeom>
+                    <a:noFill/>
+                    <a:ln>
+                      <a:noFill/>
+                    </a:ln>
+                  </pic:spPr>
+                </pic:pic>
+              </a:graphicData>
+            </a:graphic>
+            <wp14:sizeRelH relativeFrom="margin">
+              <wp14:pctWidth>0</wp14:pctWidth>
+            </wp14:sizeRelH>
+            <wp14:sizeRelV relativeFrom="margin">
+              <wp14:pctHeight>0</wp14:pctHeight>
+            </wp14:sizeRelV>
+          </wp:anchor>
+        </w:drawing>
+      </w:r>
+      <w:r>
+        <w:drawing>
+          <wp:anchor distT="0" distB="0" distL="114300" distR="114300" simplePos="0" relativeHeight="251692032" behindDoc="0" locked="0" layoutInCell="1" allowOverlap="1" wp14:anchorId="3F279468" wp14:editId="03E3ED04">
+            <wp:simplePos x="0" y="0"/>
+            <wp:positionH relativeFrom="margin">
+              <wp:align>left</wp:align>
+            </wp:positionH>
+            <wp:positionV relativeFrom="paragraph">
+              <wp:posOffset>37</wp:posOffset>
+            </wp:positionV>
+            <wp:extent cx="2807546" cy="3442447"/>
+            <wp:effectExtent l="0" t="0" r="0" b="5715"/>
+            <wp:wrapTopAndBottom/>
+            <wp:docPr id="2053337204" name="Kép 39"/>
+            <wp:cNvGraphicFramePr>
+              <a:graphicFrameLocks xmlns:a="http://schemas.openxmlformats.org/drawingml/2006/main" noChangeAspect="1"/>
+            </wp:cNvGraphicFramePr>
+            <a:graphic xmlns:a="http://schemas.openxmlformats.org/drawingml/2006/main">
+              <a:graphicData uri="http://schemas.openxmlformats.org/drawingml/2006/picture">
+                <pic:pic xmlns:pic="http://schemas.openxmlformats.org/drawingml/2006/picture">
+                  <pic:nvPicPr>
+                    <pic:cNvPr id="0" name="Picture 215"/>
+                    <pic:cNvPicPr>
+                      <a:picLocks noChangeAspect="1" noChangeArrowheads="1"/>
+                    </pic:cNvPicPr>
+                  </pic:nvPicPr>
+                  <pic:blipFill>
+                    <a:blip r:embed="rId59">
+                      <a:extLst>
+                        <a:ext uri="{28A0092B-C50C-407E-A947-70E740481C1C}">
+                          <a14:useLocalDpi xmlns:a14="http://schemas.microsoft.com/office/drawing/2010/main" val="0"/>
+                        </a:ext>
+                      </a:extLst>
+                    </a:blip>
+                    <a:srcRect/>
+                    <a:stretch>
+                      <a:fillRect/>
+                    </a:stretch>
+                  </pic:blipFill>
+                  <pic:spPr bwMode="auto">
+                    <a:xfrm>
+                      <a:off x="0" y="0"/>
+                      <a:ext cx="2807546" cy="3442447"/>
+                    </a:xfrm>
+                    <a:prstGeom prst="rect">
+                      <a:avLst/>
+                    </a:prstGeom>
+                    <a:noFill/>
+                    <a:ln>
+                      <a:noFill/>
+                    </a:ln>
+                  </pic:spPr>
+                </pic:pic>
+              </a:graphicData>
+            </a:graphic>
+          </wp:anchor>
+        </w:drawing>
+      </w:r>
+    </w:p>
+    <w:p>
+      <w:pPr>
+        <w:jc w:val="both"/>
+      </w:pPr>
+      <w:r>
+        <w:drawing>
+          <wp:inline distT="0" distB="0" distL="0" distR="0" wp14:anchorId="4BBB1DFB" wp14:editId="390ED653">
+            <wp:extent cx="5760720" cy="2956560"/>
+            <wp:effectExtent l="0" t="0" r="0" b="0"/>
+            <wp:docPr id="961558030" name="Kép 43"/>
+            <wp:cNvGraphicFramePr>
+              <a:graphicFrameLocks xmlns:a="http://schemas.openxmlformats.org/drawingml/2006/main" noChangeAspect="1"/>
+            </wp:cNvGraphicFramePr>
+            <a:graphic xmlns:a="http://schemas.openxmlformats.org/drawingml/2006/main">
+              <a:graphicData uri="http://schemas.openxmlformats.org/drawingml/2006/picture">
+                <pic:pic xmlns:pic="http://schemas.openxmlformats.org/drawingml/2006/picture">
+                  <pic:nvPicPr>
+                    <pic:cNvPr id="0" name="Picture 229"/>
+                    <pic:cNvPicPr>
+                      <a:picLocks noChangeAspect="1" noChangeArrowheads="1"/>
+                    </pic:cNvPicPr>
+                  </pic:nvPicPr>
+                  <pic:blipFill>
+                    <a:blip r:embed="rId60" cstate="print">
+                      <a:extLst>
+                        <a:ext uri="{28A0092B-C50C-407E-A947-70E740481C1C}">
+                          <a14:useLocalDpi xmlns:a14="http://schemas.microsoft.com/office/drawing/2010/main" val="0"/>
+                        </a:ext>
+                      </a:extLst>
+                    </a:blip>
+                    <a:srcRect/>
+                    <a:stretch>
+                      <a:fillRect/>
+                    </a:stretch>
+                  </pic:blipFill>
+                  <pic:spPr bwMode="auto">
+                    <a:xfrm>
+                      <a:off x="0" y="0"/>
+                      <a:ext cx="5760720" cy="2956560"/>
+                    </a:xfrm>
+                    <a:prstGeom prst="rect">
+                      <a:avLst/>
+                    </a:prstGeom>
+                    <a:noFill/>
+                    <a:ln>
+                      <a:noFill/>
+                    </a:ln>
+                  </pic:spPr>
+                </pic:pic>
+              </a:graphicData>
+            </a:graphic>
+          </wp:inline>
+        </w:drawing>
+      </w:r>
+    </w:p>
+    <w:p>
+      <w:pPr>
+        <w:jc w:val="both"/>
+      </w:pPr>
+    </w:p>
+    <w:p>
+      <w:pPr>
+        <w:jc w:val="both"/>
+        <w:rPr>
+          <w:i/>
+          <w:iCs/>
+          <w:u w:val="single"/>
+        </w:rPr>
+      </w:pPr>
+      <w:r>
+        <w:rPr>
+          <w:i/>
+          <w:iCs/>
+          <w:u w:val="single"/>
+        </w:rPr>
+        <w:t>A teszt eredménye – SIKERES</w:t>
       </w:r>
     </w:p>
     <w:p>
@@ -7098,11 +9163,363 @@
       <w:r>
         <w:tab/>
       </w:r>
-    </w:p>
-    <w:p>
-      <w:pPr>
-        <w:jc w:val="both"/>
-      </w:pPr>
+      <w:r>
+        <w:t>Látszik, hogy kiépült a VPN kapcsolat a két telephely között és az is látszik, hogy a csomagok a forrásnál titkosítva vannak és a célnál pedig ez</w:t>
+      </w:r>
+      <w:r>
+        <w:t>ek</w:t>
+      </w:r>
+      <w:r>
+        <w:t xml:space="preserve"> a titkosítás</w:t>
+      </w:r>
+      <w:r>
+        <w:t xml:space="preserve">ok </w:t>
+      </w:r>
+      <w:r>
+        <w:t>pedig fel</w:t>
+      </w:r>
+      <w:r>
+        <w:t xml:space="preserve"> vannak </w:t>
+      </w:r>
+      <w:r>
+        <w:t>old</w:t>
+      </w:r>
+      <w:r>
+        <w:t>va</w:t>
+      </w:r>
+      <w:r>
+        <w:t>.</w:t>
+      </w:r>
+    </w:p>
+    <w:p>
+      <w:pPr>
+        <w:jc w:val="both"/>
+      </w:pPr>
+    </w:p>
+    <w:p>
+      <w:pPr>
+        <w:ind w:firstLine="708"/>
+      </w:pPr>
+      <w:r>
+        <w:lastRenderedPageBreak/>
+        <w:br/>
+      </w:r>
+      <w:r>
+        <w:pict w14:anchorId="74DD5ECE">
+          <v:rect id="_x0000_i1188" style="width:470.3pt;height:1.2pt" o:hralign="center" o:hrstd="t" o:hr="t" fillcolor="#a0a0a0" stroked="f"/>
+        </w:pict>
+      </w:r>
+    </w:p>
+    <w:p>
+      <w:pPr>
+        <w:pStyle w:val="Cmsor1"/>
+        <w:rPr>
+          <w:rStyle w:val="CmChar"/>
+          <w:rFonts w:ascii="Bell MT" w:hAnsi="Bell MT"/>
+          <w:b/>
+          <w:bCs/>
+          <w:color w:val="EDED0D"/>
+          <w:sz w:val="44"/>
+          <w:szCs w:val="44"/>
+          <w:u w:val="single"/>
+        </w:rPr>
+      </w:pPr>
+      <w:r>
+        <w:rPr>
+          <w:rStyle w:val="CmChar"/>
+          <w:rFonts w:ascii="Bell MT" w:hAnsi="Bell MT"/>
+          <w:b/>
+          <w:bCs/>
+          <w:color w:val="77206D" w:themeColor="accent5" w:themeShade="BF"/>
+          <w:sz w:val="44"/>
+          <w:szCs w:val="44"/>
+          <w:u w:val="single"/>
+        </w:rPr>
+        <w:t>Windows Auto</w:t>
+      </w:r>
+      <w:r>
+        <w:rPr>
+          <w:rStyle w:val="CmChar"/>
+          <w:rFonts w:ascii="Bell MT" w:hAnsi="Bell MT"/>
+          <w:b/>
+          <w:bCs/>
+          <w:color w:val="EDED0D"/>
+          <w:sz w:val="44"/>
+          <w:szCs w:val="44"/>
+          <w:u w:val="single"/>
+        </w:rPr>
+        <w:t>matic Backup</w:t>
+      </w:r>
+      <w:r>
+        <w:rPr>
+          <w:rStyle w:val="CmChar"/>
+          <w:rFonts w:ascii="Bell MT" w:hAnsi="Bell MT"/>
+          <w:b/>
+          <w:bCs/>
+          <w:color w:val="EDED0D"/>
+          <w:sz w:val="44"/>
+          <w:szCs w:val="44"/>
+          <w:u w:val="single"/>
+        </w:rPr>
+        <w:t>:</w:t>
+      </w:r>
+    </w:p>
+    <w:p>
+      <w:pPr>
+        <w:jc w:val="both"/>
+      </w:pPr>
+      <w:r>
+        <w:tab/>
+      </w:r>
+      <w:r>
+        <w:t xml:space="preserve">Az </w:t>
+      </w:r>
+      <w:r>
+        <w:rPr>
+          <w:b/>
+          <w:bCs/>
+        </w:rPr>
+        <w:t>IBM</w:t>
+      </w:r>
+      <w:r>
+        <w:t xml:space="preserve"> központban lévő </w:t>
+      </w:r>
+      <w:r>
+        <w:rPr>
+          <w:b/>
+          <w:bCs/>
+        </w:rPr>
+        <w:t xml:space="preserve">automatikus backup </w:t>
+      </w:r>
+      <w:r>
+        <w:rPr>
+          <w:i/>
+          <w:iCs/>
+        </w:rPr>
+        <w:t>szervert</w:t>
+      </w:r>
+      <w:r>
+        <w:t xml:space="preserve"> teszteljük, hogy megfelelően készít-e </w:t>
+      </w:r>
+      <w:r>
+        <w:rPr>
+          <w:i/>
+          <w:iCs/>
+        </w:rPr>
+        <w:t>biztonsági mentést</w:t>
+      </w:r>
+      <w:r>
+        <w:t xml:space="preserve"> a kijelölt, illetve a rendszerfájlokról.</w:t>
+      </w:r>
+    </w:p>
+    <w:p>
+      <w:pPr>
+        <w:jc w:val="both"/>
+      </w:pPr>
+    </w:p>
+    <w:p>
+      <w:pPr>
+        <w:jc w:val="both"/>
+        <w:rPr>
+          <w:i/>
+          <w:iCs/>
+          <w:u w:val="single"/>
+        </w:rPr>
+      </w:pPr>
+      <w:r>
+        <w:rPr>
+          <w:i/>
+          <w:iCs/>
+          <w:u w:val="single"/>
+        </w:rPr>
+        <w:t>Vizsgált eszközök:</w:t>
+      </w:r>
+    </w:p>
+    <w:p>
+      <w:pPr>
+        <w:pStyle w:val="Listaszerbekezds"/>
+        <w:numPr>
+          <w:ilvl w:val="0"/>
+          <w:numId w:val="2"/>
+        </w:numPr>
+        <w:jc w:val="both"/>
+        <w:rPr>
+          <w:b/>
+          <w:bCs/>
+          <w:noProof/>
+        </w:rPr>
+      </w:pPr>
+      <w:r>
+        <w:rPr>
+          <w:b/>
+          <w:bCs/>
+          <w:noProof/>
+        </w:rPr>
+        <w:t>IBM_CNTRL_SRVR_FILE</w:t>
+      </w:r>
+    </w:p>
+    <w:p>
+      <w:pPr>
+        <w:jc w:val="both"/>
+        <w:rPr>
+          <w:i/>
+          <w:iCs/>
+          <w:u w:val="single"/>
+        </w:rPr>
+      </w:pPr>
+      <w:r>
+        <w:rPr>
+          <w:i/>
+          <w:iCs/>
+          <w:u w:val="single"/>
+        </w:rPr>
+        <w:t>Teszt menete:</w:t>
+      </w:r>
+    </w:p>
+    <w:p>
+      <w:pPr>
+        <w:jc w:val="both"/>
+      </w:pPr>
+      <w:r>
+        <w:tab/>
+        <w:t>A teszt során</w:t>
+      </w:r>
+      <w:r>
+        <w:t xml:space="preserve"> a </w:t>
+      </w:r>
+      <w:r>
+        <w:rPr>
+          <w:i/>
+          <w:iCs/>
+        </w:rPr>
+        <w:t>[elérési út]</w:t>
+      </w:r>
+      <w:r>
+        <w:t xml:space="preserve"> elérési úton található mappából kitörljük az egyik fájlt majd az </w:t>
+      </w:r>
+      <w:r>
+        <w:rPr>
+          <w:i/>
+          <w:iCs/>
+        </w:rPr>
+        <w:t>automatikus mentés</w:t>
+      </w:r>
+      <w:r>
+        <w:t xml:space="preserve"> segítségével </w:t>
+      </w:r>
+      <w:r>
+        <w:rPr>
+          <w:i/>
+          <w:iCs/>
+        </w:rPr>
+        <w:t>visszaállítjuk</w:t>
+      </w:r>
+      <w:r>
+        <w:t xml:space="preserve"> ezt a már „elveszett” fájlt egy régebben készült </w:t>
+      </w:r>
+      <w:r>
+        <w:rPr>
+          <w:i/>
+          <w:iCs/>
+        </w:rPr>
+        <w:t>biztonsági mentésből</w:t>
+      </w:r>
+      <w:r>
+        <w:t>.</w:t>
+      </w:r>
+    </w:p>
+    <w:p>
+      <w:pPr>
+        <w:jc w:val="both"/>
+      </w:pPr>
+    </w:p>
+    <w:p>
+      <w:pPr>
+        <w:jc w:val="both"/>
+        <w:rPr>
+          <w:i/>
+          <w:iCs/>
+          <w:u w:val="single"/>
+        </w:rPr>
+      </w:pPr>
+      <w:r>
+        <w:rPr>
+          <w:i/>
+          <w:iCs/>
+          <w:u w:val="single"/>
+        </w:rPr>
+        <w:t>Teszt várt eredménye:</w:t>
+      </w:r>
+    </w:p>
+    <w:p>
+      <w:pPr>
+        <w:jc w:val="both"/>
+      </w:pPr>
+      <w:r>
+        <w:tab/>
+      </w:r>
+    </w:p>
+    <w:p>
+      <w:pPr>
+        <w:jc w:val="both"/>
+      </w:pPr>
+    </w:p>
+    <w:p>
+      <w:pPr>
+        <w:jc w:val="both"/>
+      </w:pPr>
+    </w:p>
+    <w:p>
+      <w:pPr>
+        <w:jc w:val="both"/>
+        <w:rPr>
+          <w:i/>
+          <w:iCs/>
+          <w:u w:val="single"/>
+        </w:rPr>
+      </w:pPr>
+      <w:r>
+        <w:rPr>
+          <w:i/>
+          <w:iCs/>
+          <w:u w:val="single"/>
+        </w:rPr>
+        <w:t>A teszt eredménye – SIKERES</w:t>
+      </w:r>
+    </w:p>
+    <w:p>
+      <w:pPr>
+        <w:jc w:val="both"/>
+      </w:pPr>
+      <w:r>
+        <w:tab/>
+      </w:r>
+      <w:r>
+        <w:t xml:space="preserve">Mivel az </w:t>
+      </w:r>
+      <w:r>
+        <w:rPr>
+          <w:i/>
+          <w:iCs/>
+        </w:rPr>
+        <w:t>automatizált biztonsági mentés</w:t>
+      </w:r>
+      <w:r>
+        <w:t xml:space="preserve"> </w:t>
+      </w:r>
+      <w:r>
+        <w:t xml:space="preserve">készített erről a </w:t>
+      </w:r>
+      <w:r>
+        <w:rPr>
+          <w:i/>
+          <w:iCs/>
+        </w:rPr>
+        <w:t>fájlról</w:t>
+      </w:r>
+      <w:r>
+        <w:t xml:space="preserve"> is egy másolatot így könnyedén vissza tudtuk állítani az egyik ilyen mentésből.</w:t>
+      </w:r>
     </w:p>
     <w:p>
       <w:pPr>
@@ -7117,6 +9534,415 @@
         </w:pict>
       </w:r>
     </w:p>
+    <w:p/>
+    <w:p>
+      <w:pPr>
+        <w:pStyle w:val="Cmsor1"/>
+        <w:rPr>
+          <w:rStyle w:val="CmChar"/>
+          <w:rFonts w:ascii="Bell MT" w:hAnsi="Bell MT"/>
+          <w:b/>
+          <w:bCs/>
+          <w:color w:val="EDED0D"/>
+          <w:sz w:val="44"/>
+          <w:szCs w:val="44"/>
+          <w:u w:val="single"/>
+        </w:rPr>
+      </w:pPr>
+      <w:r>
+        <w:rPr>
+          <w:rStyle w:val="CmChar"/>
+          <w:rFonts w:ascii="Bell MT" w:hAnsi="Bell MT"/>
+          <w:b/>
+          <w:bCs/>
+          <w:color w:val="77206D" w:themeColor="accent5" w:themeShade="BF"/>
+          <w:sz w:val="44"/>
+          <w:szCs w:val="44"/>
+          <w:u w:val="single"/>
+        </w:rPr>
+        <w:t>Windows</w:t>
+      </w:r>
+      <w:r>
+        <w:rPr>
+          <w:rStyle w:val="CmChar"/>
+          <w:rFonts w:ascii="Bell MT" w:hAnsi="Bell MT"/>
+          <w:b/>
+          <w:bCs/>
+          <w:color w:val="77206D" w:themeColor="accent5" w:themeShade="BF"/>
+          <w:sz w:val="44"/>
+          <w:szCs w:val="44"/>
+          <w:u w:val="single"/>
+        </w:rPr>
+        <w:t xml:space="preserve"> </w:t>
+      </w:r>
+      <w:r>
+        <w:rPr>
+          <w:rStyle w:val="CmChar"/>
+          <w:rFonts w:ascii="Bell MT" w:hAnsi="Bell MT"/>
+          <w:b/>
+          <w:bCs/>
+          <w:color w:val="EDED0D"/>
+          <w:sz w:val="44"/>
+          <w:szCs w:val="44"/>
+          <w:u w:val="single"/>
+        </w:rPr>
+        <w:t>ADDS</w:t>
+      </w:r>
+      <w:r>
+        <w:rPr>
+          <w:rStyle w:val="CmChar"/>
+          <w:rFonts w:ascii="Bell MT" w:hAnsi="Bell MT"/>
+          <w:b/>
+          <w:bCs/>
+          <w:color w:val="EDED0D"/>
+          <w:sz w:val="44"/>
+          <w:szCs w:val="44"/>
+          <w:u w:val="single"/>
+        </w:rPr>
+        <w:t>:</w:t>
+      </w:r>
+    </w:p>
+    <w:p>
+      <w:pPr>
+        <w:jc w:val="both"/>
+      </w:pPr>
+      <w:r>
+        <w:tab/>
+        <w:t xml:space="preserve">Az </w:t>
+      </w:r>
+      <w:r>
+        <w:rPr>
+          <w:b/>
+          <w:bCs/>
+        </w:rPr>
+        <w:t>IBM</w:t>
+      </w:r>
+      <w:r>
+        <w:t xml:space="preserve"> központban lévő </w:t>
+      </w:r>
+      <w:r>
+        <w:rPr>
+          <w:b/>
+          <w:bCs/>
+        </w:rPr>
+        <w:t>ADDS</w:t>
+      </w:r>
+      <w:r>
+        <w:t xml:space="preserve"> szerveren konfigurált </w:t>
+      </w:r>
+      <w:r>
+        <w:rPr>
+          <w:i/>
+          <w:iCs/>
+        </w:rPr>
+        <w:t>domain</w:t>
+      </w:r>
+      <w:r>
+        <w:t>-be léptet</w:t>
+      </w:r>
+      <w:r>
+        <w:t>j</w:t>
+      </w:r>
+      <w:r>
+        <w:t xml:space="preserve">ük be az </w:t>
+      </w:r>
+      <w:r>
+        <w:rPr>
+          <w:b/>
+          <w:bCs/>
+        </w:rPr>
+        <w:t>IBM_CNTRL_PRJCTPNS_SRVRR_ADMINPC</w:t>
+      </w:r>
+      <w:r>
+        <w:t xml:space="preserve">-t egy </w:t>
+      </w:r>
+      <w:r>
+        <w:rPr>
+          <w:i/>
+          <w:iCs/>
+        </w:rPr>
+        <w:t>rendszergazdai felfelhasználóval</w:t>
+      </w:r>
+      <w:r>
+        <w:t xml:space="preserve">, ezzel ellenőrizve azt, hogy </w:t>
+      </w:r>
+      <w:r>
+        <w:t>működik a domain-be léptetés, illetve a felhasználói beállítások.</w:t>
+      </w:r>
+    </w:p>
+    <w:p>
+      <w:pPr>
+        <w:jc w:val="both"/>
+      </w:pPr>
+    </w:p>
+    <w:p>
+      <w:pPr>
+        <w:jc w:val="both"/>
+        <w:rPr>
+          <w:i/>
+          <w:iCs/>
+          <w:u w:val="single"/>
+        </w:rPr>
+      </w:pPr>
+      <w:r>
+        <w:rPr>
+          <w:i/>
+          <w:iCs/>
+          <w:u w:val="single"/>
+        </w:rPr>
+        <w:lastRenderedPageBreak/>
+        <w:t>Vizsgált eszközök:</w:t>
+      </w:r>
+    </w:p>
+    <w:p>
+      <w:pPr>
+        <w:pStyle w:val="Listaszerbekezds"/>
+        <w:numPr>
+          <w:ilvl w:val="0"/>
+          <w:numId w:val="2"/>
+        </w:numPr>
+        <w:jc w:val="both"/>
+        <w:rPr>
+          <w:b/>
+          <w:bCs/>
+          <w:noProof/>
+        </w:rPr>
+      </w:pPr>
+      <w:r>
+        <w:rPr>
+          <w:b/>
+          <w:bCs/>
+          <w:noProof/>
+        </w:rPr>
+        <w:t>IBM_CNTRL_SRVR_</w:t>
+      </w:r>
+      <w:r>
+        <w:rPr>
+          <w:b/>
+          <w:bCs/>
+          <w:noProof/>
+        </w:rPr>
+        <w:t>AD</w:t>
+      </w:r>
+    </w:p>
+    <w:p>
+      <w:pPr>
+        <w:pStyle w:val="Listaszerbekezds"/>
+        <w:numPr>
+          <w:ilvl w:val="0"/>
+          <w:numId w:val="2"/>
+        </w:numPr>
+        <w:jc w:val="both"/>
+        <w:rPr>
+          <w:b/>
+          <w:bCs/>
+          <w:noProof/>
+        </w:rPr>
+      </w:pPr>
+      <w:r>
+        <w:rPr>
+          <w:b/>
+          <w:bCs/>
+          <w:noProof/>
+        </w:rPr>
+        <w:t>IBM_CNTRL_PRJCTPNS_SRVRR_ADMINPC</w:t>
+      </w:r>
+    </w:p>
+    <w:p>
+      <w:pPr>
+        <w:jc w:val="both"/>
+        <w:rPr>
+          <w:i/>
+          <w:iCs/>
+          <w:u w:val="single"/>
+        </w:rPr>
+      </w:pPr>
+      <w:r>
+        <w:rPr>
+          <w:i/>
+          <w:iCs/>
+          <w:u w:val="single"/>
+        </w:rPr>
+        <w:t>Teszt menete:</w:t>
+      </w:r>
+    </w:p>
+    <w:p>
+      <w:pPr>
+        <w:jc w:val="both"/>
+      </w:pPr>
+      <w:r>
+        <w:tab/>
+        <w:t xml:space="preserve">A teszt során </w:t>
+      </w:r>
+      <w:r>
+        <w:t xml:space="preserve">belépünk egy </w:t>
+      </w:r>
+      <w:r>
+        <w:rPr>
+          <w:i/>
+          <w:iCs/>
+        </w:rPr>
+        <w:t>rendszergazdai felhasználóval</w:t>
+      </w:r>
+      <w:r>
+        <w:t xml:space="preserve"> az </w:t>
+      </w:r>
+      <w:r>
+        <w:rPr>
+          <w:b/>
+          <w:bCs/>
+        </w:rPr>
+        <w:t>IBM_CNTRL_PRJCTPNS_SRVRR_ADMINPC</w:t>
+      </w:r>
+      <w:r>
+        <w:t xml:space="preserve">-re és megnézzük </w:t>
+      </w:r>
+      <w:r>
+        <w:rPr>
+          <w:i/>
+          <w:iCs/>
+        </w:rPr>
+        <w:t>grafikus felületen</w:t>
+      </w:r>
+      <w:r>
+        <w:t xml:space="preserve"> az egyes telephelyek pár </w:t>
+      </w:r>
+      <w:r>
+        <w:rPr>
+          <w:i/>
+          <w:iCs/>
+        </w:rPr>
+        <w:t>felhasználójának a beállításait</w:t>
+      </w:r>
+      <w:r>
+        <w:t>.</w:t>
+      </w:r>
+    </w:p>
+    <w:p>
+      <w:pPr>
+        <w:jc w:val="both"/>
+      </w:pPr>
+    </w:p>
+    <w:p>
+      <w:pPr>
+        <w:jc w:val="both"/>
+        <w:rPr>
+          <w:i/>
+          <w:iCs/>
+          <w:u w:val="single"/>
+        </w:rPr>
+      </w:pPr>
+      <w:r>
+        <w:rPr>
+          <w:i/>
+          <w:iCs/>
+          <w:u w:val="single"/>
+        </w:rPr>
+        <w:t>Teszt várt eredménye:</w:t>
+      </w:r>
+    </w:p>
+    <w:p>
+      <w:pPr>
+        <w:jc w:val="both"/>
+      </w:pPr>
+      <w:r>
+        <w:tab/>
+      </w:r>
+    </w:p>
+    <w:p>
+      <w:pPr>
+        <w:jc w:val="both"/>
+      </w:pPr>
+    </w:p>
+    <w:p>
+      <w:pPr>
+        <w:jc w:val="both"/>
+      </w:pPr>
+    </w:p>
+    <w:p>
+      <w:pPr>
+        <w:jc w:val="both"/>
+        <w:rPr>
+          <w:i/>
+          <w:iCs/>
+          <w:u w:val="single"/>
+        </w:rPr>
+      </w:pPr>
+      <w:r>
+        <w:rPr>
+          <w:i/>
+          <w:iCs/>
+          <w:u w:val="single"/>
+        </w:rPr>
+        <w:t>A teszt eredménye – SIKERES</w:t>
+      </w:r>
+    </w:p>
+    <w:p>
+      <w:pPr>
+        <w:jc w:val="both"/>
+      </w:pPr>
+      <w:r>
+        <w:tab/>
+      </w:r>
+      <w:r>
+        <w:t xml:space="preserve">A kliens gépet be tudtuk léptetni a </w:t>
+      </w:r>
+      <w:r>
+        <w:rPr>
+          <w:i/>
+          <w:iCs/>
+        </w:rPr>
+        <w:t>domain</w:t>
+      </w:r>
+      <w:r>
+        <w:t xml:space="preserve">-be és megtudtuk nézni a </w:t>
+      </w:r>
+      <w:r>
+        <w:rPr>
+          <w:i/>
+          <w:iCs/>
+        </w:rPr>
+        <w:t>felhasználóina</w:t>
+      </w:r>
+      <w:r>
+        <w:rPr>
+          <w:i/>
+          <w:iCs/>
+        </w:rPr>
+        <w:t>k</w:t>
+      </w:r>
+      <w:r>
+        <w:rPr>
+          <w:i/>
+          <w:iCs/>
+        </w:rPr>
+        <w:t xml:space="preserve"> beállításait</w:t>
+      </w:r>
+      <w:r>
+        <w:t xml:space="preserve"> a különböző telephelyeknek</w:t>
+      </w:r>
+      <w:r>
+        <w:t>.</w:t>
+      </w:r>
+    </w:p>
+    <w:p>
+      <w:pPr>
+        <w:ind w:firstLine="708"/>
+      </w:pPr>
+      <w:r>
+        <w:br/>
+      </w:r>
+      <w:r>
+        <w:pict w14:anchorId="0AAB859E">
+          <v:rect id="_x0000_i1272" style="width:470.3pt;height:1.2pt" o:hralign="center" o:hrstd="t" o:hr="t" fillcolor="#a0a0a0" stroked="f"/>
+        </w:pict>
+      </w:r>
+    </w:p>
+    <w:p/>
+    <w:p/>
+    <w:p/>
+    <w:p/>
+    <w:p/>
     <w:p/>
     <w:p/>
     <w:p/>
@@ -7124,12 +9950,12 @@
     <w:p/>
     <w:p/>
     <w:sectPr>
-      <w:headerReference w:type="even" r:id="rId38"/>
-      <w:headerReference w:type="default" r:id="rId39"/>
-      <w:footerReference w:type="even" r:id="rId40"/>
-      <w:footerReference w:type="default" r:id="rId41"/>
-      <w:headerReference w:type="first" r:id="rId42"/>
-      <w:footerReference w:type="first" r:id="rId43"/>
+      <w:headerReference w:type="even" r:id="rId61"/>
+      <w:headerReference w:type="default" r:id="rId62"/>
+      <w:footerReference w:type="even" r:id="rId63"/>
+      <w:footerReference w:type="default" r:id="rId64"/>
+      <w:headerReference w:type="first" r:id="rId65"/>
+      <w:footerReference w:type="first" r:id="rId66"/>
       <w:pgSz w:w="11906" w:h="16838"/>
       <w:pgMar w:top="1417" w:right="1417" w:bottom="1417" w:left="1417" w:header="708" w:footer="708" w:gutter="0"/>
       <w:cols w:space="708"/>

</xml_diff>